<commit_message>
Add greed_coop_mcts FACN v1 stack with livelock detect/unblock and SH03 lifelong tooling.
Include ablation summaries and docs; omit trajectories, SYN dumps, and local package backups.

Co-authored-by: Cursor <cursoragent@cursor.com>
</commit_message>
<xml_diff>
--- a/docs/CISC7298_Progress_Report_1.docx
+++ b/docs/CISC7298_Progress_Report_1.docx
@@ -1,6 +1,6 @@
 
 <file path=word/document.xml><?xml version="1.0" encoding="utf-8"?>
-<w:document xmlns:wpc="http://schemas.microsoft.com/office/word/2010/wordprocessingCanvas" xmlns:cx="http://schemas.microsoft.com/office/drawing/2014/chartex" xmlns:cx1="http://schemas.microsoft.com/office/drawing/2015/9/8/chartex" xmlns:cx2="http://schemas.microsoft.com/office/drawing/2015/10/21/chartex" xmlns:cx3="http://schemas.microsoft.com/office/drawing/2016/5/9/chartex" xmlns:cx4="http://schemas.microsoft.com/office/drawing/2016/5/10/chartex" xmlns:cx5="http://schemas.microsoft.com/office/drawing/2016/5/11/chartex" xmlns:cx6="http://schemas.microsoft.com/office/drawing/2016/5/12/chartex" xmlns:cx7="http://schemas.microsoft.com/office/drawing/2016/5/13/chartex" xmlns:cx8="http://schemas.microsoft.com/office/drawing/2016/5/14/chartex" xmlns:mc="http://schemas.openxmlformats.org/markup-compatibility/2006" xmlns:aink="http://schemas.microsoft.com/office/drawing/2016/ink" xmlns:am3d="http://schemas.microsoft.com/office/drawing/2017/model3d" xmlns:o="urn:schemas-microsoft-com:office:office" xmlns:r="http://schemas.openxmlformats.org/officeDocument/2006/relationships" xmlns:m="http://schemas.openxmlformats.org/officeDocument/2006/math" xmlns:v="urn:schemas-microsoft-com:vml" xmlns:wp14="http://schemas.microsoft.com/office/word/2010/wordprocessingDrawing" xmlns:wp="http://schemas.openxmlformats.org/drawingml/2006/wordprocessingDrawing" xmlns:w10="urn:schemas-microsoft-com:office:word" xmlns:w="http://schemas.openxmlformats.org/wordprocessingml/2006/main" xmlns:w14="http://schemas.microsoft.com/office/word/2010/wordml" xmlns:w15="http://schemas.microsoft.com/office/word/2012/wordml" xmlns:w16cid="http://schemas.microsoft.com/office/word/2016/wordml/cid" xmlns:w16se="http://schemas.microsoft.com/office/word/2015/wordml/symex" xmlns:wpg="http://schemas.microsoft.com/office/word/2010/wordprocessingGroup" xmlns:wpi="http://schemas.microsoft.com/office/word/2010/wordprocessingInk" xmlns:wne="http://schemas.microsoft.com/office/word/2006/wordml" xmlns:wps="http://schemas.microsoft.com/office/word/2010/wordprocessingShape" mc:Ignorable="w14 w15 w16se w16cid wp14">
+<w:document xmlns:wpc="http://schemas.microsoft.com/office/word/2010/wordprocessingCanvas" xmlns:mc="http://schemas.openxmlformats.org/markup-compatibility/2006" xmlns:o="urn:schemas-microsoft-com:office:office" xmlns:r="http://schemas.openxmlformats.org/officeDocument/2006/relationships" xmlns:m="http://schemas.openxmlformats.org/officeDocument/2006/math" xmlns:v="urn:schemas-microsoft-com:vml" xmlns:wp14="http://schemas.microsoft.com/office/word/2010/wordprocessingDrawing" xmlns:wp="http://schemas.openxmlformats.org/drawingml/2006/wordprocessingDrawing" xmlns:w="http://schemas.openxmlformats.org/wordprocessingml/2006/main" xmlns:w14="http://schemas.microsoft.com/office/word/2010/wordml" xmlns:w10="urn:schemas-microsoft-com:office:word" xmlns:w15="http://schemas.microsoft.com/office/word/2012/wordml" xmlns:wpg="http://schemas.microsoft.com/office/word/2010/wordprocessingGroup" xmlns:wpi="http://schemas.microsoft.com/office/word/2010/wordprocessingInk" xmlns:wne="http://schemas.microsoft.com/office/word/2006/wordml" xmlns:wps="http://schemas.microsoft.com/office/word/2010/wordprocessingShape" xmlns:wpsCustomData="http://www.wps.cn/officeDocument/2013/wpsCustomData" mc:Ignorable="w14 w15 wp14">
   <w:body>
     <w:p>
       <w:pPr>
@@ -87,31 +87,7 @@
           <w:szCs w:val="24"/>
           <w:lang w:val="en-SG"/>
         </w:rPr>
-        <w:t>CISC7298</w:t>
-      </w:r>
-      <w:r>
-        <w:rPr>
-          <w:rFonts w:ascii="Times New Roman" w:hAnsi="Times New Roman" w:cs="Times New Roman"/>
-          <w:b/>
-          <w:bCs/>
-          <w:color w:val="000000"/>
-          <w:sz w:val="24"/>
-          <w:szCs w:val="24"/>
-          <w:lang w:val="en-SG"/>
-        </w:rPr>
-        <w:t xml:space="preserve"> </w:t>
-      </w:r>
-      <w:r>
-        <w:rPr>
-          <w:rFonts w:ascii="Times New Roman" w:hAnsi="Times New Roman" w:cs="Times New Roman"/>
-          <w:b/>
-          <w:bCs/>
-          <w:color w:val="000000"/>
-          <w:sz w:val="24"/>
-          <w:szCs w:val="24"/>
-          <w:lang w:val="en-SG"/>
-        </w:rPr>
-        <w:t>Project Report</w:t>
+        <w:t>CISC7298 Project Report</w:t>
       </w:r>
     </w:p>
     <w:p>
@@ -196,43 +172,7 @@
           <w:szCs w:val="24"/>
           <w:lang w:val="en-SG"/>
         </w:rPr>
-        <w:t xml:space="preserve"> Semester 202</w:t>
-      </w:r>
-      <w:r>
-        <w:rPr>
-          <w:rFonts w:ascii="Times New Roman" w:hAnsi="Times New Roman" w:cs="Times New Roman"/>
-          <w:b/>
-          <w:bCs/>
-          <w:color w:val="000000"/>
-          <w:sz w:val="24"/>
-          <w:szCs w:val="24"/>
-          <w:lang w:val="en-SG"/>
-        </w:rPr>
-        <w:t>6</w:t>
-      </w:r>
-      <w:r>
-        <w:rPr>
-          <w:rFonts w:ascii="Times New Roman" w:hAnsi="Times New Roman" w:cs="Times New Roman"/>
-          <w:b/>
-          <w:bCs/>
-          <w:color w:val="000000"/>
-          <w:sz w:val="24"/>
-          <w:szCs w:val="24"/>
-          <w:lang w:val="en-SG"/>
-        </w:rPr>
-        <w:t>/202</w:t>
-      </w:r>
-      <w:r>
-        <w:rPr>
-          <w:rFonts w:ascii="Times New Roman" w:hAnsi="Times New Roman" w:cs="Times New Roman"/>
-          <w:b/>
-          <w:bCs/>
-          <w:color w:val="000000"/>
-          <w:sz w:val="24"/>
-          <w:szCs w:val="24"/>
-          <w:lang w:val="en-SG"/>
-        </w:rPr>
-        <w:t>7</w:t>
+        <w:t xml:space="preserve"> Semester 2026/2027</w:t>
       </w:r>
     </w:p>
     <w:p>
@@ -259,13 +199,13 @@
         <w:adjustRightInd w:val="0"/>
         <w:spacing w:after="0" w:line="240" w:lineRule="auto"/>
         <w:rPr>
-          <w:rFonts w:ascii="Times New Roman" w:hAnsi="Times New Roman" w:cs="Times New Roman"/>
-          <w:b/>
-          <w:bCs/>
-          <w:color w:val="000000"/>
-          <w:sz w:val="24"/>
-          <w:szCs w:val="24"/>
-          <w:lang w:val="en-SG"/>
+          <w:rFonts w:hint="default" w:ascii="Times New Roman" w:hAnsi="Times New Roman" w:cs="Times New Roman" w:eastAsiaTheme="minorEastAsia"/>
+          <w:b/>
+          <w:bCs/>
+          <w:color w:val="000000"/>
+          <w:sz w:val="24"/>
+          <w:szCs w:val="24"/>
+          <w:lang w:val="en-US" w:eastAsia="zh-CN"/>
         </w:rPr>
       </w:pPr>
       <w:r>
@@ -279,6 +219,18 @@
           <w:lang w:val="en-SG"/>
         </w:rPr>
         <w:t>Name:</w:t>
+      </w:r>
+      <w:r>
+        <w:rPr>
+          <w:rFonts w:hint="eastAsia" w:ascii="Times New Roman" w:hAnsi="Times New Roman" w:cs="Times New Roman"/>
+          <w:b/>
+          <w:bCs/>
+          <w:color w:val="000000"/>
+          <w:sz w:val="24"/>
+          <w:szCs w:val="24"/>
+          <w:lang w:val="en-US" w:eastAsia="zh-CN"/>
+        </w:rPr>
+        <w:t xml:space="preserve"> Zeng Kaibo</w:t>
       </w:r>
     </w:p>
     <w:p>
@@ -288,18 +240,18 @@
         <w:adjustRightInd w:val="0"/>
         <w:spacing w:after="0" w:line="240" w:lineRule="auto"/>
         <w:rPr>
-          <w:rFonts w:ascii="Times New Roman" w:hAnsi="Times New Roman" w:cs="Times New Roman" w:hint="eastAsia"/>
-          <w:b/>
-          <w:bCs/>
-          <w:color w:val="000000"/>
-          <w:sz w:val="24"/>
-          <w:szCs w:val="24"/>
-          <w:lang w:val="en-SG"/>
+          <w:rFonts w:hint="default" w:ascii="Times New Roman" w:hAnsi="Times New Roman" w:cs="Times New Roman" w:eastAsiaTheme="minorEastAsia"/>
+          <w:b/>
+          <w:bCs/>
+          <w:color w:val="000000"/>
+          <w:sz w:val="24"/>
+          <w:szCs w:val="24"/>
+          <w:lang w:val="en-US" w:eastAsia="zh-CN"/>
         </w:rPr>
       </w:pPr>
       <w:r>
         <w:rPr>
-          <w:rFonts w:ascii="Times New Roman" w:hAnsi="Times New Roman" w:cs="Times New Roman" w:hint="eastAsia"/>
+          <w:rFonts w:hint="eastAsia" w:ascii="Times New Roman" w:hAnsi="Times New Roman" w:cs="Times New Roman"/>
           <w:b/>
           <w:bCs/>
           <w:color w:val="000000"/>
@@ -321,8 +273,18 @@
         </w:rPr>
         <w:t>tudent ID:</w:t>
       </w:r>
-      <w:bookmarkStart w:id="0" w:name="_GoBack"/>
-      <w:bookmarkEnd w:id="0"/>
+      <w:r>
+        <w:rPr>
+          <w:rFonts w:hint="eastAsia" w:ascii="Times New Roman" w:hAnsi="Times New Roman" w:cs="Times New Roman"/>
+          <w:b/>
+          <w:bCs/>
+          <w:color w:val="000000"/>
+          <w:sz w:val="24"/>
+          <w:szCs w:val="24"/>
+          <w:lang w:val="en-US" w:eastAsia="zh-CN"/>
+        </w:rPr>
+        <w:t xml:space="preserve"> MC566823</w:t>
+      </w:r>
     </w:p>
     <w:p>
       <w:pPr>
@@ -367,31 +329,50 @@
           <w:szCs w:val="24"/>
           <w:lang w:val="en-SG"/>
         </w:rPr>
-        <w:t>Title and Abstract</w:t>
-      </w:r>
-      <w:r>
-        <w:rPr>
-          <w:rFonts w:ascii="Times New Roman" w:hAnsi="Times New Roman" w:cs="Times New Roman"/>
-          <w:b/>
-          <w:bCs/>
-          <w:color w:val="000000"/>
-          <w:sz w:val="24"/>
-          <w:szCs w:val="24"/>
-          <w:lang w:val="en-SG"/>
-        </w:rPr>
-        <w:t>:</w:t>
+        <w:t>Title and Abstract:</w:t>
       </w:r>
     </w:p>
     <w:tbl>
       <w:tblPr>
-        <w:tblStyle w:val="TableGrid"/>
+        <w:tblStyle w:val="6"/>
         <w:tblW w:w="0" w:type="auto"/>
-        <w:tblLook w:val="04A0" w:firstRow="1" w:lastRow="0" w:firstColumn="1" w:lastColumn="0" w:noHBand="0" w:noVBand="1"/>
+        <w:tblInd w:w="0" w:type="dxa"/>
+        <w:tblBorders>
+          <w:top w:val="single" w:color="auto" w:sz="4" w:space="0"/>
+          <w:left w:val="single" w:color="auto" w:sz="4" w:space="0"/>
+          <w:bottom w:val="single" w:color="auto" w:sz="4" w:space="0"/>
+          <w:right w:val="single" w:color="auto" w:sz="4" w:space="0"/>
+          <w:insideH w:val="single" w:color="auto" w:sz="4" w:space="0"/>
+          <w:insideV w:val="single" w:color="auto" w:sz="4" w:space="0"/>
+        </w:tblBorders>
+        <w:tblLayout w:type="autofit"/>
+        <w:tblCellMar>
+          <w:top w:w="0" w:type="dxa"/>
+          <w:left w:w="108" w:type="dxa"/>
+          <w:bottom w:w="0" w:type="dxa"/>
+          <w:right w:w="108" w:type="dxa"/>
+        </w:tblCellMar>
       </w:tblPr>
       <w:tblGrid>
         <w:gridCol w:w="10456"/>
       </w:tblGrid>
       <w:tr>
+        <w:tblPrEx>
+          <w:tblBorders>
+            <w:top w:val="single" w:color="auto" w:sz="4" w:space="0"/>
+            <w:left w:val="single" w:color="auto" w:sz="4" w:space="0"/>
+            <w:bottom w:val="single" w:color="auto" w:sz="4" w:space="0"/>
+            <w:right w:val="single" w:color="auto" w:sz="4" w:space="0"/>
+            <w:insideH w:val="single" w:color="auto" w:sz="4" w:space="0"/>
+            <w:insideV w:val="single" w:color="auto" w:sz="4" w:space="0"/>
+          </w:tblBorders>
+          <w:tblCellMar>
+            <w:top w:w="0" w:type="dxa"/>
+            <w:left w:w="108" w:type="dxa"/>
+            <w:bottom w:w="0" w:type="dxa"/>
+            <w:right w:w="108" w:type="dxa"/>
+          </w:tblCellMar>
+        </w:tblPrEx>
         <w:tc>
           <w:tcPr>
             <w:tcW w:w="10456" w:type="dxa"/>
@@ -424,7 +405,7 @@
                 <w:b w:val="0"/>
                 <w:sz w:val="22"/>
               </w:rPr>
-              <w:t>Abstract. This project studies lifelong multi-agent pickup-and-delivery (MAPD) for automated guided vehicles (AGVs) under competition-style warehouse rules: a 20x20 grid, FIFO station queues, in-place turns of at most 90° per second, and a mandatory one-second dwell for pickup and unload. We develop a hierarchical planner that keeps a fast engine-level spatiotemporal A* layer (M0) as the default and escalates to windowed Enhanced Conflict-Based Search (ECBS) only when runtime stall signals indicate that local search is insufficient. Competition legality is enforced end-to-end (no same-tick move-and-turn; door-side pickup; cargo continuity; validated trajectories). On a curriculum of twenty custom maps with official 100-task instances, a completed five-way bake-off shows that hierarchical M0&lt;-&gt;ECBS and pure windowed ECBS both achieve 20/20 full completions with VALID trajectories, while reactive PIBT, pure M0, and priority planning lose throughput or validity on congested maps. Hierarchy further reduces average simulation makespan relative to always-on ECBS (about 4616 vs 7364 ticks), confirming that gated escalation is an effective accuracy-efficiency trade-off.</w:t>
+              <w:t>Abstract. This project studies lifelong multi-agent pickup-and-delivery (MAPD) for automated guided vehicles (AGVs) on a 20x20 warehouse grid. Station queues follow FIFO order. Turns are performed in place and finish within one second (including 180 degrees), without moving in the same second. Pickup and unload each require a one-second dwell. We propose a hierarchical planner: a fast spatiotemporal A* layer (M0) runs by default, and windowed Enhanced Conflict-Based Search (ECBS) is used only when progress stalls. Two small neural networks support the hierarchy: SwapNet for station task swaps under M0, and StallEscalateNet for M0-to-ECBS handoff. All trajectories are checked by a shared validator. On twenty maps with 100 tasks each, both hierarchical M0-ECBS and pure windowed ECBS finish all tasks with valid trajectories. Reactive PIBT, M0 alone, and priority planning do worse on congested maps. Hierarchy also lowers average makespan versus always-on ECBS (about 4616 vs 7364 ticks), at a moderate increase in planning time.</w:t>
             </w:r>
           </w:p>
         </w:tc>
@@ -437,7 +418,7 @@
         <w:adjustRightInd w:val="0"/>
         <w:spacing w:after="0" w:line="240" w:lineRule="auto"/>
         <w:rPr>
-          <w:rFonts w:ascii="Times New Roman" w:hAnsi="Times New Roman" w:cs="Times New Roman" w:hint="eastAsia"/>
+          <w:rFonts w:hint="eastAsia" w:ascii="Times New Roman" w:hAnsi="Times New Roman" w:cs="Times New Roman"/>
           <w:b/>
           <w:bCs/>
           <w:color w:val="000000"/>
@@ -473,31 +454,50 @@
           <w:szCs w:val="24"/>
           <w:lang w:val="en-SG"/>
         </w:rPr>
-        <w:t>Introduction (with OR w/o Related Work/Literature Review)</w:t>
-      </w:r>
-      <w:r>
-        <w:rPr>
-          <w:rFonts w:ascii="Times New Roman" w:hAnsi="Times New Roman" w:cs="Times New Roman"/>
-          <w:b/>
-          <w:bCs/>
-          <w:color w:val="000000"/>
-          <w:sz w:val="24"/>
-          <w:szCs w:val="24"/>
-          <w:lang w:val="en-SG"/>
-        </w:rPr>
-        <w:t>:</w:t>
+        <w:t>Introduction (with OR w/o Related Work/Literature Review):</w:t>
       </w:r>
     </w:p>
     <w:tbl>
       <w:tblPr>
-        <w:tblStyle w:val="TableGrid"/>
+        <w:tblStyle w:val="6"/>
         <w:tblW w:w="0" w:type="auto"/>
-        <w:tblLook w:val="04A0" w:firstRow="1" w:lastRow="0" w:firstColumn="1" w:lastColumn="0" w:noHBand="0" w:noVBand="1"/>
+        <w:tblInd w:w="0" w:type="dxa"/>
+        <w:tblBorders>
+          <w:top w:val="single" w:color="auto" w:sz="4" w:space="0"/>
+          <w:left w:val="single" w:color="auto" w:sz="4" w:space="0"/>
+          <w:bottom w:val="single" w:color="auto" w:sz="4" w:space="0"/>
+          <w:right w:val="single" w:color="auto" w:sz="4" w:space="0"/>
+          <w:insideH w:val="single" w:color="auto" w:sz="4" w:space="0"/>
+          <w:insideV w:val="single" w:color="auto" w:sz="4" w:space="0"/>
+        </w:tblBorders>
+        <w:tblLayout w:type="autofit"/>
+        <w:tblCellMar>
+          <w:top w:w="0" w:type="dxa"/>
+          <w:left w:w="108" w:type="dxa"/>
+          <w:bottom w:w="0" w:type="dxa"/>
+          <w:right w:w="108" w:type="dxa"/>
+        </w:tblCellMar>
       </w:tblPr>
       <w:tblGrid>
         <w:gridCol w:w="10456"/>
       </w:tblGrid>
       <w:tr>
+        <w:tblPrEx>
+          <w:tblBorders>
+            <w:top w:val="single" w:color="auto" w:sz="4" w:space="0"/>
+            <w:left w:val="single" w:color="auto" w:sz="4" w:space="0"/>
+            <w:bottom w:val="single" w:color="auto" w:sz="4" w:space="0"/>
+            <w:right w:val="single" w:color="auto" w:sz="4" w:space="0"/>
+            <w:insideH w:val="single" w:color="auto" w:sz="4" w:space="0"/>
+            <w:insideV w:val="single" w:color="auto" w:sz="4" w:space="0"/>
+          </w:tblBorders>
+          <w:tblCellMar>
+            <w:top w:w="0" w:type="dxa"/>
+            <w:left w:w="108" w:type="dxa"/>
+            <w:bottom w:w="0" w:type="dxa"/>
+            <w:right w:w="108" w:type="dxa"/>
+          </w:tblCellMar>
+        </w:tblPrEx>
         <w:tc>
           <w:tcPr>
             <w:tcW w:w="10456" w:type="dxa"/>
@@ -515,7 +515,7 @@
                 <w:b w:val="0"/>
                 <w:sz w:val="22"/>
               </w:rPr>
-              <w:t>Warehouse AGV fleets must continuously assign pickups, route around static obstacles and other robots, and respect station FIFO order. Classical one-shot multi-agent path finding (MAPF) solvers do not directly cover lifelong task release; pure reactive methods (e.g., PIBT) scale well but often deadlock in narrow corridors; full joint search (CBS/ECBS) improves conflict resolution but can inflate makespan and wall-clock time if used for every planning wave.</w:t>
+              <w:t>Warehouse AGVs must keep assigning pickups, avoid static obstacles and other robots, and respect FIFO station order. One-shot multi-agent path finding (MAPF) does not cover lifelong task release. Reactive methods such as PIBT scale well but often deadlock in narrow corridors. Joint search methods such as CBS and ECBS resolve conflicts more reliably, but calling them at every step can raise makespan and runtime.</w:t>
             </w:r>
           </w:p>
           <w:p>
@@ -530,7 +530,7 @@
                 <w:b w:val="0"/>
                 <w:sz w:val="22"/>
               </w:rPr>
-              <w:t>This work targets the MioVerse / Siemens Xcelerator AGV track setting together with the course project requirements: maximize completed deliveries under strict motion and FIFO validators. The research question is whether a hierarchical policy-run cheap spatiotemporal A* by default and invoke ECBS only on throughput stalls-can match always-ECBS completion while retaining M0 efficiency on easy maps.</w:t>
+              <w:t>Our goal is to complete as many deliveries as possible under these motion and FIFO rules. The main question is whether a hierarchical policy can match always-ECBS completion: use cheap spatiotemporal A* most of the time, and call ECBS only when throughput stalls, so that easy maps still keep M0-level efficiency. Two small neural aides help this policy without replacing search.</w:t>
             </w:r>
           </w:p>
           <w:p>
@@ -545,7 +545,7 @@
                 <w:b w:val="0"/>
                 <w:sz w:val="22"/>
               </w:rPr>
-              <w:t>Related work. MAPF has a mature literature on Conflict-Based Search (CBS) and weighted ECBS for bounded-suboptimal joint plans. Priority planning (PP) and windowed lifelong planners (WHCA*/RHCR-style) address continuous operation with limited horizons. PIBT provides strongly scalable one-step conflict resolution without reservations. Our design sits between these extremes: M0 provides continuous lifelong execution with reservation tables; an automatic gate monitors stall metrics and triggers ECBS waves; handoff snapshots preserve cargo and FIFO heads so escalation does not break competition validators. The gate is not a per-map hardcode: cold-start hardness scores may bias early behavior, but escalation decisions are driven by online progress signals.</w:t>
+              <w:t>Related work. Conflict-Based Search (CBS) and weighted ECBS are standard for bounded-suboptimal joint plans. Priority planning and windowed lifelong planners (WHCA*/RHCR-style) support continuous operation with limited horizons. PIBT offers fast one-step conflict resolution without reservations. Learned components in MAPF are often large policies; we instead use narrow binary networks as gates inside a classical stack. M0 runs lifelong traffic with reservation tables. StallEscalateNet and rule stall signals decide when to start ECBS. A handoff snapshot keeps cargo state and FIFO heads consistent across the switch.</w:t>
             </w:r>
           </w:p>
         </w:tc>
@@ -558,7 +558,7 @@
         <w:adjustRightInd w:val="0"/>
         <w:spacing w:after="0" w:line="240" w:lineRule="auto"/>
         <w:rPr>
-          <w:rFonts w:ascii="Times New Roman" w:hAnsi="Times New Roman" w:cs="Times New Roman" w:hint="eastAsia"/>
+          <w:rFonts w:hint="eastAsia" w:ascii="Times New Roman" w:hAnsi="Times New Roman" w:cs="Times New Roman"/>
           <w:b/>
           <w:bCs/>
           <w:color w:val="000000"/>
@@ -594,31 +594,50 @@
           <w:szCs w:val="24"/>
           <w:lang w:val="en-SG"/>
         </w:rPr>
-        <w:t>Methodology</w:t>
-      </w:r>
-      <w:r>
-        <w:rPr>
-          <w:rFonts w:ascii="Times New Roman" w:hAnsi="Times New Roman" w:cs="Times New Roman"/>
-          <w:b/>
-          <w:bCs/>
-          <w:color w:val="000000"/>
-          <w:sz w:val="24"/>
-          <w:szCs w:val="24"/>
-          <w:lang w:val="en-SG"/>
-        </w:rPr>
-        <w:t>:</w:t>
+        <w:t>Methodology:</w:t>
       </w:r>
     </w:p>
     <w:tbl>
       <w:tblPr>
-        <w:tblStyle w:val="TableGrid"/>
+        <w:tblStyle w:val="6"/>
         <w:tblW w:w="0" w:type="auto"/>
-        <w:tblLook w:val="04A0" w:firstRow="1" w:lastRow="0" w:firstColumn="1" w:lastColumn="0" w:noHBand="0" w:noVBand="1"/>
+        <w:tblInd w:w="0" w:type="dxa"/>
+        <w:tblBorders>
+          <w:top w:val="single" w:color="auto" w:sz="4" w:space="0"/>
+          <w:left w:val="single" w:color="auto" w:sz="4" w:space="0"/>
+          <w:bottom w:val="single" w:color="auto" w:sz="4" w:space="0"/>
+          <w:right w:val="single" w:color="auto" w:sz="4" w:space="0"/>
+          <w:insideH w:val="single" w:color="auto" w:sz="4" w:space="0"/>
+          <w:insideV w:val="single" w:color="auto" w:sz="4" w:space="0"/>
+        </w:tblBorders>
+        <w:tblLayout w:type="autofit"/>
+        <w:tblCellMar>
+          <w:top w:w="0" w:type="dxa"/>
+          <w:left w:w="108" w:type="dxa"/>
+          <w:bottom w:w="0" w:type="dxa"/>
+          <w:right w:w="108" w:type="dxa"/>
+        </w:tblCellMar>
       </w:tblPr>
       <w:tblGrid>
         <w:gridCol w:w="10456"/>
       </w:tblGrid>
       <w:tr>
+        <w:tblPrEx>
+          <w:tblBorders>
+            <w:top w:val="single" w:color="auto" w:sz="4" w:space="0"/>
+            <w:left w:val="single" w:color="auto" w:sz="4" w:space="0"/>
+            <w:bottom w:val="single" w:color="auto" w:sz="4" w:space="0"/>
+            <w:right w:val="single" w:color="auto" w:sz="4" w:space="0"/>
+            <w:insideH w:val="single" w:color="auto" w:sz="4" w:space="0"/>
+            <w:insideV w:val="single" w:color="auto" w:sz="4" w:space="0"/>
+          </w:tblBorders>
+          <w:tblCellMar>
+            <w:top w:w="0" w:type="dxa"/>
+            <w:left w:w="108" w:type="dxa"/>
+            <w:bottom w:w="0" w:type="dxa"/>
+            <w:right w:w="108" w:type="dxa"/>
+          </w:tblCellMar>
+        </w:tblPrEx>
         <w:tc>
           <w:tcPr>
             <w:tcW w:w="10456" w:type="dxa"/>
@@ -636,7 +655,7 @@
                 <w:b w:val="0"/>
                 <w:sz w:val="22"/>
               </w:rPr>
-              <w:t>Problem model. Each map provides six pickup stations and sixteen dropoff hubs on a 20x20 grid. Tasks are released from official CSVs (100 tasks in the primary comparison protocol; larger 400-task stress tests are also used). AGVs may carry at most one package; pickup occurs on the approach door beside a station after a one-second no-turn dwell; unload occurs on a free four-neighbor of the destination hub with the same dwell rule.</w:t>
+              <w:t>Problem model. Each map has six pickup stations and sixteen dropoff hubs on a 20x20 grid. The main study uses 100-task instances; larger 400-task runs are used for stress tests. An AGV carries at most one package. Pickup happens at the approach cell next to a station after a one-second dwell with no turning. Unload happens on a free 4-neighbor of the destination hub, with the same dwell rule.</w:t>
             </w:r>
           </w:p>
           <w:p>
@@ -651,7 +670,7 @@
                 <w:b w:val="0"/>
                 <w:sz w:val="22"/>
               </w:rPr>
-              <w:t>Layer M0 (default). The simulation engine assigns free AGVs to station FIFO heads (at most one approacher per station) and plans with spatiotemporal A* under a rolling moving-obstacle horizon, forbidding vertex collisions and edge swaps. This layer is fast on open maps but may stall when corridors jam.</w:t>
+              <w:t>Layer M0 (default). Free AGVs are assigned to station FIFO heads, with at most one approacher per station. Paths are planned by spatiotemporal A* with a rolling moving-obstacle horizon. Vertex collisions and edge swaps are forbidden. M0 is fast on open maps, but it may stall when corridors become congested.</w:t>
             </w:r>
           </w:p>
           <w:p>
@@ -666,7 +685,7 @@
                 <w:b w:val="0"/>
                 <w:sz w:val="22"/>
               </w:rPr>
-              <w:t>Hierarchical gate and ECBS escalation. A LifelongGateTracker starts with M0 and monitors runtime signals (done plateau, assign failures, wall-efficiency). When M0 stalls after a recovery window, the system freezes a handoff snapshot and continues with windowed joint ECBS planning. Escalation never reorders surface FIFO queues. Map-hardness / narrow-cut features are used only as cold-start context; they do not permanently force ECBS on selected map IDs.</w:t>
+              <w:t>Hierarchical gate and ECBS escalation. The system starts in M0 and tracks runtime signals such as completion plateaus and assignment failures. If M0 still stalls after a short recovery window, or if StallEscalateNet fires, we take a handoff snapshot and continue with windowed joint ECBS. FIFO queue order is never changed by escalation.</w:t>
             </w:r>
           </w:p>
           <w:p>
@@ -681,7 +700,7 @@
                 <w:b w:val="0"/>
                 <w:sz w:val="22"/>
               </w:rPr>
-              <w:t>Windowed ECBS legality. Pure windowed ECBS is also evaluated as a strong joint baseline. Engineering fixes required for VALID trajectories include: (i) refuse off-pad falling edges that wipe cargo annotations; (ii) heal “ghost cargo” when the trajectory still shows loaded=true but the planner bag lost the task; (iii) refuse pickup while already carrying another task and force unload first. These guards eliminate premature_unload and surface-FIFO violations observed on dense maps (e.g., SH11/SH12).</w:t>
+              <w:t>AI module 1: SwapNet. SwapNet is a small MLP with structure 16 -&gt; 48 -&gt; 48 -&gt; 1 and a sigmoid output. Input is a 16-dimensional feature vector for a candidate station swap under M0: normalized ETAs and distances of the far and near agents, their ETA gap, task urgency, remaining time and SLA slack, urgent gain, whether the near agent is idle or already holds an urgent task, queue depth, margin ratio, and SLA meet/miss flags. Output is P(authorize swap). Training imitates a heuristic teacher on logged swap contexts and favors precision over recall. At runtime the engine still rejects any swap that would skip a FIFO station head, so the network cannot break queue legality.</w:t>
             </w:r>
           </w:p>
           <w:p>
@@ -696,7 +715,52 @@
                 <w:b w:val="0"/>
                 <w:sz w:val="22"/>
               </w:rPr>
-              <w:t>Baselines. We implemented a five-way compare harness under identical maps, task CSVs, motion rules, and a shared hybrid validator: (1) reactive PIBT; (2) M0-only spatiotemporal A*; (3) priority-planning allocator + A*; (4) windowed ECBS without M0 hierarchy; (5) hierarchical M0&lt;-&gt;ECBS (proposed).</w:t>
+              <w:t>AI module 2: StallEscalateNet. StallEscalateNet is an MLP with structure 15 -&gt; 48 -&gt; 48 -&gt; 1 and a sigmoid output. Input is a 15-dimensional stall vector: map hardness and narrow-cut priors, done ratio, normalized plateau / idle / assign-fail / throughput-drop / wall-tick streaks, plan-fail rate, wall-window hit, sim-per-task, wall elapsed, has-work, loaded ratio, and recent completions in a short sim window. Output is P(escalate M0 to ECBS), compared with a high threshold (about 0.72) so that healthy M0 on easy maps is left alone. The network is trained to catch wall-clock thrash while avoiding unnecessary escalation.</w:t>
+            </w:r>
+          </w:p>
+          <w:p>
+            <w:pPr>
+              <w:spacing w:after="120" w:line="276" w:lineRule="auto"/>
+              <w:ind w:firstLine="360"/>
+              <w:jc w:val="both"/>
+            </w:pPr>
+            <w:r>
+              <w:rPr>
+                <w:rFonts w:ascii="Times New Roman" w:hAnsi="Times New Roman" w:eastAsia="Times New Roman"/>
+                <w:b w:val="0"/>
+                <w:sz w:val="22"/>
+              </w:rPr>
+              <w:t>Other AI modules. WaveNet (MLP on 12-D agent features, optional map CNN) and SceneDifficultyNet (map CNN plus scalars) exist for wave ranking and scene hardness estimation. They are offline or optional in this report and are not required for the hierarchical baseline numbers below. Search itself remains classical: M0 spatiotemporal A* and windowed ECBS.</w:t>
+            </w:r>
+          </w:p>
+          <w:p>
+            <w:pPr>
+              <w:spacing w:after="120" w:line="276" w:lineRule="auto"/>
+              <w:ind w:firstLine="360"/>
+              <w:jc w:val="both"/>
+            </w:pPr>
+            <w:r>
+              <w:rPr>
+                <w:rFonts w:ascii="Times New Roman" w:hAnsi="Times New Roman" w:eastAsia="Times New Roman"/>
+                <w:b w:val="0"/>
+                <w:sz w:val="22"/>
+              </w:rPr>
+              <w:t>Windowed ECBS baseline. We also run pure windowed ECBS as a joint planning baseline. To keep trajectories valid, we added a few practical guards: reject unload events off the legal pad; restore cargo state when the log still shows loaded but the planner bag lost the task; and refuse a new pickup while another task is still carried. These fixes remove premature unload and FIFO errors seen on dense maps such as SH11 and SH12.</w:t>
+            </w:r>
+          </w:p>
+          <w:p>
+            <w:pPr>
+              <w:spacing w:after="120" w:line="276" w:lineRule="auto"/>
+              <w:ind w:firstLine="360"/>
+              <w:jc w:val="both"/>
+            </w:pPr>
+            <w:r>
+              <w:rPr>
+                <w:rFonts w:ascii="Times New Roman" w:hAnsi="Times New Roman" w:eastAsia="Times New Roman"/>
+                <w:b w:val="0"/>
+                <w:sz w:val="22"/>
+              </w:rPr>
+              <w:t>Baselines. Under the same maps, task files, motion rules, and validator, we compare five methods: (1) reactive PIBT; (2) M0-only spatiotemporal A*; (3) priority planning with A*; (4) windowed ECBS without hierarchy; (5) hierarchical M0-ECBS with SwapNet and StallEscalateNet (ours).</w:t>
             </w:r>
           </w:p>
         </w:tc>
@@ -709,7 +773,7 @@
         <w:adjustRightInd w:val="0"/>
         <w:spacing w:after="0" w:line="240" w:lineRule="auto"/>
         <w:rPr>
-          <w:rFonts w:ascii="Times New Roman" w:hAnsi="Times New Roman" w:cs="Times New Roman" w:hint="eastAsia"/>
+          <w:rFonts w:hint="eastAsia" w:ascii="Times New Roman" w:hAnsi="Times New Roman" w:cs="Times New Roman"/>
           <w:b/>
           <w:bCs/>
           <w:color w:val="000000"/>
@@ -745,31 +809,44 @@
           <w:szCs w:val="24"/>
           <w:lang w:val="en-SG"/>
         </w:rPr>
-        <w:t>Experimental Results</w:t>
-      </w:r>
-      <w:r>
-        <w:rPr>
-          <w:rFonts w:ascii="Times New Roman" w:hAnsi="Times New Roman" w:cs="Times New Roman"/>
-          <w:b/>
-          <w:bCs/>
-          <w:color w:val="000000"/>
-          <w:sz w:val="24"/>
-          <w:szCs w:val="24"/>
-          <w:lang w:val="en-SG"/>
-        </w:rPr>
-        <w:t>:</w:t>
+        <w:t>Experimental Results:</w:t>
       </w:r>
     </w:p>
     <w:tbl>
       <w:tblPr>
-        <w:tblStyle w:val="TableGrid"/>
+        <w:tblStyle w:val="6"/>
         <w:tblW w:w="0" w:type="auto"/>
-        <w:tblLook w:val="04A0" w:firstRow="1" w:lastRow="0" w:firstColumn="1" w:lastColumn="0" w:noHBand="0" w:noVBand="1"/>
+        <w:tblInd w:w="0" w:type="dxa"/>
+        <w:tblBorders>
+          <w:top w:val="single" w:color="auto" w:sz="4" w:space="0"/>
+          <w:left w:val="single" w:color="auto" w:sz="4" w:space="0"/>
+          <w:bottom w:val="single" w:color="auto" w:sz="4" w:space="0"/>
+          <w:right w:val="single" w:color="auto" w:sz="4" w:space="0"/>
+          <w:insideH w:val="single" w:color="auto" w:sz="4" w:space="0"/>
+          <w:insideV w:val="single" w:color="auto" w:sz="4" w:space="0"/>
+        </w:tblBorders>
+        <w:tblLayout w:type="autofit"/>
+        <w:tblCellMar>
+          <w:top w:w="0" w:type="dxa"/>
+          <w:left w:w="108" w:type="dxa"/>
+          <w:bottom w:w="0" w:type="dxa"/>
+          <w:right w:w="108" w:type="dxa"/>
+        </w:tblCellMar>
       </w:tblPr>
       <w:tblGrid>
         <w:gridCol w:w="10456"/>
       </w:tblGrid>
       <w:tr>
+        <w:tblPrEx>
+          <w:tblBorders>
+            <w:top w:val="single" w:color="auto" w:sz="4" w:space="0"/>
+            <w:left w:val="single" w:color="auto" w:sz="4" w:space="0"/>
+            <w:bottom w:val="single" w:color="auto" w:sz="4" w:space="0"/>
+            <w:right w:val="single" w:color="auto" w:sz="4" w:space="0"/>
+            <w:insideH w:val="single" w:color="auto" w:sz="4" w:space="0"/>
+            <w:insideV w:val="single" w:color="auto" w:sz="4" w:space="0"/>
+          </w:tblBorders>
+        </w:tblPrEx>
         <w:tc>
           <w:tcPr>
             <w:tcW w:w="10456" w:type="dxa"/>
@@ -787,7 +864,7 @@
                 <w:b w:val="0"/>
                 <w:sz w:val="22"/>
               </w:rPr>
-              <w:t>Setup. Maps SH_custom_01-20 from the map-editor curriculum; official 100-task CSVs; full AGV fleets. Batch protocol: wall timeout 1800 s for constrained runs, with unlimited-wall reruns for hierarchical / ECBS instances that need more planning time; max simulation horizon up to 500000 ticks when measuring completion. Metrics: tasks completed / 100, VALID flag from the hybrid validator, simulation makespan, wall-clock seconds, and total Manhattan travel.</w:t>
+              <w:t>Setup. We evaluate maps SH_custom_01-20 with 100-task instances and the full AGV fleet. Constrained runs use a 1800 s wall-time limit; hierarchical and ECBS runs that need more planning time are repeated without that limit. Simulation horizons go up to 500000 ticks when we measure completion. Metrics are completed tasks out of 100, trajectory validity, simulation makespan, wall-clock time, and total Manhattan travel.</w:t>
             </w:r>
           </w:p>
           <w:p>
@@ -802,12 +879,12 @@
                 <w:b w:val="0"/>
                 <w:sz w:val="22"/>
               </w:rPr>
-              <w:t>Aggregate five-way results (SH01-20 x 100 tasks) are summarized in the table below. Both ECBS and Hier finish all 100 tasks on every map with VALID trajectories. Hierarchy cuts average makespan by about 37% versus always-on ECBS (4616 vs 7364), at a moderate increase in average wall-clock (704 s vs 543 s). PIBT is extremely fast but averages only 63.9 completions and fully finishes 8/20 maps. Pure M0 stays VALID but finishes only 4/20 maps. Priority planning is weakest on both completion and validity (7/20 VALID).</w:t>
+              <w:t>Aggregate results on SH01-20 are shown below. Both ECBS and Hier finish all 100 tasks on every map with valid trajectories. Hierarchy cuts average makespan by about 37% versus always-on ECBS (4616 vs 7364), with a moderate rise in average wall-clock time (704 s vs 543 s). PIBT is very fast but averages only 63.9 completed tasks and fully finishes 8/20 maps. Pure M0 stays valid but finishes only 4/20 maps. Priority planning is weakest on both completion and validity (7/20 valid).</w:t>
             </w:r>
           </w:p>
           <w:tbl>
             <w:tblPr>
-              <w:tblStyle w:val="TableGrid"/>
+              <w:tblStyle w:val="6"/>
               <w:tblW w:type="auto" w:w="0"/>
               <w:tblLook w:firstColumn="1" w:firstRow="1" w:lastColumn="0" w:lastRow="0" w:noHBand="0" w:noVBand="1" w:val="04A0"/>
             </w:tblPr>
@@ -1649,7 +1726,7 @@
                 <w:b w:val="0"/>
                 <w:sz w:val="22"/>
               </w:rPr>
-              <w:t>Representative map behavior. On easy SH01, M0 and Hier finish with low makespan (sim ≈ 546-612) while PIBT/ECBS need ≈ 2200 ticks; PP finishes 100 tasks but fails FIFO validation. On hutong-like SH03, PIBT/M0/PP collapse to ≤5 completions, whereas ECBS and Hier both reach 100/100 VALID. On SH04, Hier closely tracks M0 efficiency (sim 670 vs 684) instead of paying ECBS’s longer plan (4219). On dense SH11/SH12, after legality fixes, ECBS recovers to 100/100 VALID (sim 18021 / 16981), while Hier achieves the same completion with shorter makespan (4775 / 5220).</w:t>
+              <w:t>Map-level notes. On easy SH01, M0 and Hier finish with low makespan (about 546-612 ticks), while PIBT and ECBS need about 2200 ticks. Priority planning finishes 100 tasks but fails FIFO checks. On narrow SH03, PIBT, M0, and priority planning complete at most five tasks, while ECBS and Hier both reach 100/100 and stay valid. On SH04, Hier stays close to M0 (670 vs 684) instead of paying the longer ECBS plan (4219). On dense SH11 and SH12, after the validity fixes, ECBS reaches 100/100 (makespan 18021 and 16981), and Hier matches completion with shorter makespan (4775 and 5220).</w:t>
             </w:r>
           </w:p>
           <w:p>
@@ -1664,7 +1741,7 @@
                 <w:b w:val="0"/>
                 <w:sz w:val="22"/>
               </w:rPr>
-              <w:t>Interpretation. Reactive and local search lose throughput under congestion; always-ECBS is strong but expensive in simulation time; hierarchical M0-first with stall-triggered ECBS matches ECBS’s completion/validity envelope while reclaiming M0-like makespan on many maps. This is the central Progress Report 1 empirical claim.</w:t>
+              <w:t>Discussion. Reactive and local search lose throughput under congestion. Always-on ECBS is reliable but costly in simulation time. Hierarchical M0-first planning with StallEscalateNet handoff matches ECBS on completion and validity, while recovering much of M0's makespan on easier maps. SwapNet mainly helps M0 serve urgent tasks without an early ECBS call; it does not replace joint search on narrow maps. This is the main empirical finding of Progress Report 1.</w:t>
             </w:r>
           </w:p>
         </w:tc>
@@ -1677,7 +1754,7 @@
         <w:adjustRightInd w:val="0"/>
         <w:spacing w:after="0" w:line="240" w:lineRule="auto"/>
         <w:rPr>
-          <w:rFonts w:ascii="Times New Roman" w:hAnsi="Times New Roman" w:cs="Times New Roman" w:hint="eastAsia"/>
+          <w:rFonts w:hint="eastAsia" w:ascii="Times New Roman" w:hAnsi="Times New Roman" w:cs="Times New Roman"/>
           <w:b/>
           <w:bCs/>
           <w:color w:val="000000"/>
@@ -1713,31 +1790,50 @@
           <w:szCs w:val="24"/>
           <w:lang w:val="en-SG"/>
         </w:rPr>
-        <w:t>Conclusion</w:t>
-      </w:r>
-      <w:r>
-        <w:rPr>
-          <w:rFonts w:ascii="Times New Roman" w:hAnsi="Times New Roman" w:cs="Times New Roman"/>
-          <w:b/>
-          <w:bCs/>
-          <w:color w:val="000000"/>
-          <w:sz w:val="24"/>
-          <w:szCs w:val="24"/>
-          <w:lang w:val="en-SG"/>
-        </w:rPr>
-        <w:t>:</w:t>
+        <w:t>Conclusion:</w:t>
       </w:r>
     </w:p>
     <w:tbl>
       <w:tblPr>
-        <w:tblStyle w:val="TableGrid"/>
+        <w:tblStyle w:val="6"/>
         <w:tblW w:w="0" w:type="auto"/>
-        <w:tblLook w:val="04A0" w:firstRow="1" w:lastRow="0" w:firstColumn="1" w:lastColumn="0" w:noHBand="0" w:noVBand="1"/>
+        <w:tblInd w:w="0" w:type="dxa"/>
+        <w:tblBorders>
+          <w:top w:val="single" w:color="auto" w:sz="4" w:space="0"/>
+          <w:left w:val="single" w:color="auto" w:sz="4" w:space="0"/>
+          <w:bottom w:val="single" w:color="auto" w:sz="4" w:space="0"/>
+          <w:right w:val="single" w:color="auto" w:sz="4" w:space="0"/>
+          <w:insideH w:val="single" w:color="auto" w:sz="4" w:space="0"/>
+          <w:insideV w:val="single" w:color="auto" w:sz="4" w:space="0"/>
+        </w:tblBorders>
+        <w:tblLayout w:type="autofit"/>
+        <w:tblCellMar>
+          <w:top w:w="0" w:type="dxa"/>
+          <w:left w:w="108" w:type="dxa"/>
+          <w:bottom w:w="0" w:type="dxa"/>
+          <w:right w:w="108" w:type="dxa"/>
+        </w:tblCellMar>
       </w:tblPr>
       <w:tblGrid>
         <w:gridCol w:w="10456"/>
       </w:tblGrid>
       <w:tr>
+        <w:tblPrEx>
+          <w:tblBorders>
+            <w:top w:val="single" w:color="auto" w:sz="4" w:space="0"/>
+            <w:left w:val="single" w:color="auto" w:sz="4" w:space="0"/>
+            <w:bottom w:val="single" w:color="auto" w:sz="4" w:space="0"/>
+            <w:right w:val="single" w:color="auto" w:sz="4" w:space="0"/>
+            <w:insideH w:val="single" w:color="auto" w:sz="4" w:space="0"/>
+            <w:insideV w:val="single" w:color="auto" w:sz="4" w:space="0"/>
+          </w:tblBorders>
+          <w:tblCellMar>
+            <w:top w:w="0" w:type="dxa"/>
+            <w:left w:w="108" w:type="dxa"/>
+            <w:bottom w:w="0" w:type="dxa"/>
+            <w:right w:w="108" w:type="dxa"/>
+          </w:tblCellMar>
+        </w:tblPrEx>
         <w:tc>
           <w:tcPr>
             <w:tcW w:w="10456" w:type="dxa"/>
@@ -1755,7 +1851,7 @@
                 <w:b w:val="0"/>
                 <w:sz w:val="22"/>
               </w:rPr>
-              <w:t>Progress to date delivers a competition-legal hierarchical lifelong MAPD stack, a legality-hardened windowed ECBS baseline, and a completed SH01-20 x 100 five-method comparison. Evidence shows that gated M0&lt;-&gt;ECBS preserves 20/20 VALID full completions while reducing average makespan relative to always-on ECBS. Next steps for Progress Report 2 include: (i) aligned 400-task hierarchical stress results across the same maps; (ii) quantitative analysis of handoff timing and stall features versus map structure; (iii) failure-case studies on residual high-wall maps; and (iv) optional learning-based gates only if they improve escalation decisions without harming VALID rates.</w:t>
+              <w:t>So far we have built a hierarchical lifelong MAPD system with two online neural aides (SwapNet and StallEscalateNet), a windowed ECBS baseline with stronger validity checks, and a full SH01-20 comparison with 100 tasks per map. Gated M0-ECBS keeps 20/20 full completions with valid trajectories and reduces average makespan relative to always-on ECBS. For Progress Report 2 we plan to: (i) report aligned 400-task stress results on the same maps; (ii) ablate SwapNet and StallEscalateNet more carefully; (iii) relate handoff timing to map structure; and (iv) study remaining high wall-time cases.</w:t>
             </w:r>
           </w:p>
         </w:tc>
@@ -1768,7 +1864,7 @@
         <w:adjustRightInd w:val="0"/>
         <w:spacing w:after="0" w:line="240" w:lineRule="auto"/>
         <w:rPr>
-          <w:rFonts w:ascii="Times New Roman" w:hAnsi="Times New Roman" w:cs="Times New Roman" w:hint="eastAsia"/>
+          <w:rFonts w:hint="eastAsia" w:ascii="Times New Roman" w:hAnsi="Times New Roman" w:cs="Times New Roman"/>
           <w:b/>
           <w:bCs/>
           <w:color w:val="000000"/>
@@ -1781,29 +1877,29 @@
     <w:sectPr>
       <w:pgSz w:w="11906" w:h="16838"/>
       <w:pgMar w:top="720" w:right="720" w:bottom="720" w:left="720" w:header="708" w:footer="708" w:gutter="0"/>
-      <w:cols w:space="708"/>
-      <w:docGrid w:linePitch="360"/>
+      <w:cols w:space="708" w:num="1"/>
+      <w:docGrid w:linePitch="360" w:charSpace="0"/>
     </w:sectPr>
   </w:body>
 </w:document>
 </file>
 
 <file path=word/endnotes.xml><?xml version="1.0" encoding="utf-8"?>
-<w:endnotes xmlns:wpc="http://schemas.microsoft.com/office/word/2010/wordprocessingCanvas" xmlns:cx="http://schemas.microsoft.com/office/drawing/2014/chartex" xmlns:cx1="http://schemas.microsoft.com/office/drawing/2015/9/8/chartex" xmlns:cx2="http://schemas.microsoft.com/office/drawing/2015/10/21/chartex" xmlns:cx3="http://schemas.microsoft.com/office/drawing/2016/5/9/chartex" xmlns:cx4="http://schemas.microsoft.com/office/drawing/2016/5/10/chartex" xmlns:cx5="http://schemas.microsoft.com/office/drawing/2016/5/11/chartex" xmlns:cx6="http://schemas.microsoft.com/office/drawing/2016/5/12/chartex" xmlns:cx7="http://schemas.microsoft.com/office/drawing/2016/5/13/chartex" xmlns:cx8="http://schemas.microsoft.com/office/drawing/2016/5/14/chartex" xmlns:mc="http://schemas.openxmlformats.org/markup-compatibility/2006" xmlns:aink="http://schemas.microsoft.com/office/drawing/2016/ink" xmlns:am3d="http://schemas.microsoft.com/office/drawing/2017/model3d" xmlns:o="urn:schemas-microsoft-com:office:office" xmlns:r="http://schemas.openxmlformats.org/officeDocument/2006/relationships" xmlns:m="http://schemas.openxmlformats.org/officeDocument/2006/math" xmlns:v="urn:schemas-microsoft-com:vml" xmlns:wp14="http://schemas.microsoft.com/office/word/2010/wordprocessingDrawing" xmlns:wp="http://schemas.openxmlformats.org/drawingml/2006/wordprocessingDrawing" xmlns:w10="urn:schemas-microsoft-com:office:word" xmlns:w="http://schemas.openxmlformats.org/wordprocessingml/2006/main" xmlns:w14="http://schemas.microsoft.com/office/word/2010/wordml" xmlns:w15="http://schemas.microsoft.com/office/word/2012/wordml" xmlns:w16cid="http://schemas.microsoft.com/office/word/2016/wordml/cid" xmlns:w16se="http://schemas.microsoft.com/office/word/2015/wordml/symex" xmlns:wpg="http://schemas.microsoft.com/office/word/2010/wordprocessingGroup" xmlns:wpi="http://schemas.microsoft.com/office/word/2010/wordprocessingInk" xmlns:wne="http://schemas.microsoft.com/office/word/2006/wordml" xmlns:wps="http://schemas.microsoft.com/office/word/2010/wordprocessingShape" mc:Ignorable="w14 w15 w16se w16cid wp14">
-  <w:endnote w:type="separator" w:id="-1">
+<w:endnotes xmlns:wpc="http://schemas.microsoft.com/office/word/2010/wordprocessingCanvas" xmlns:mc="http://schemas.openxmlformats.org/markup-compatibility/2006" xmlns:o="urn:schemas-microsoft-com:office:office" xmlns:r="http://schemas.openxmlformats.org/officeDocument/2006/relationships" xmlns:m="http://schemas.openxmlformats.org/officeDocument/2006/math" xmlns:v="urn:schemas-microsoft-com:vml" xmlns:wp14="http://schemas.microsoft.com/office/word/2010/wordprocessingDrawing" xmlns:wp="http://schemas.openxmlformats.org/drawingml/2006/wordprocessingDrawing" xmlns:w="http://schemas.openxmlformats.org/wordprocessingml/2006/main" xmlns:w14="http://schemas.microsoft.com/office/word/2010/wordml" xmlns:w15="http://schemas.microsoft.com/office/word/2012/wordml" xmlns:w10="urn:schemas-microsoft-com:office:word" xmlns:wpg="http://schemas.microsoft.com/office/word/2010/wordprocessingGroup" xmlns:wpi="http://schemas.microsoft.com/office/word/2010/wordprocessingInk" xmlns:wne="http://schemas.microsoft.com/office/word/2006/wordml" xmlns:wps="http://schemas.microsoft.com/office/word/2010/wordprocessingShape" xmlns:wpsCustomData="http://www.wps.cn/officeDocument/2013/wpsCustomData" mc:Ignorable="w14 w15 wp14">
+  <w:endnote w:type="separator" w:id="0">
     <w:p>
       <w:pPr>
-        <w:spacing w:after="0" w:line="240" w:lineRule="auto"/>
+        <w:spacing w:line="240" w:lineRule="auto"/>
       </w:pPr>
       <w:r>
         <w:separator/>
       </w:r>
     </w:p>
   </w:endnote>
-  <w:endnote w:type="continuationSeparator" w:id="0">
+  <w:endnote w:type="continuationSeparator" w:id="1">
     <w:p>
       <w:pPr>
-        <w:spacing w:after="0" w:line="240" w:lineRule="auto"/>
+        <w:spacing w:line="240" w:lineRule="auto"/>
       </w:pPr>
       <w:r>
         <w:continuationSeparator/>
@@ -1814,21 +1910,21 @@
 </file>
 
 <file path=word/footnotes.xml><?xml version="1.0" encoding="utf-8"?>
-<w:footnotes xmlns:wpc="http://schemas.microsoft.com/office/word/2010/wordprocessingCanvas" xmlns:cx="http://schemas.microsoft.com/office/drawing/2014/chartex" xmlns:cx1="http://schemas.microsoft.com/office/drawing/2015/9/8/chartex" xmlns:cx2="http://schemas.microsoft.com/office/drawing/2015/10/21/chartex" xmlns:cx3="http://schemas.microsoft.com/office/drawing/2016/5/9/chartex" xmlns:cx4="http://schemas.microsoft.com/office/drawing/2016/5/10/chartex" xmlns:cx5="http://schemas.microsoft.com/office/drawing/2016/5/11/chartex" xmlns:cx6="http://schemas.microsoft.com/office/drawing/2016/5/12/chartex" xmlns:cx7="http://schemas.microsoft.com/office/drawing/2016/5/13/chartex" xmlns:cx8="http://schemas.microsoft.com/office/drawing/2016/5/14/chartex" xmlns:mc="http://schemas.openxmlformats.org/markup-compatibility/2006" xmlns:aink="http://schemas.microsoft.com/office/drawing/2016/ink" xmlns:am3d="http://schemas.microsoft.com/office/drawing/2017/model3d" xmlns:o="urn:schemas-microsoft-com:office:office" xmlns:r="http://schemas.openxmlformats.org/officeDocument/2006/relationships" xmlns:m="http://schemas.openxmlformats.org/officeDocument/2006/math" xmlns:v="urn:schemas-microsoft-com:vml" xmlns:wp14="http://schemas.microsoft.com/office/word/2010/wordprocessingDrawing" xmlns:wp="http://schemas.openxmlformats.org/drawingml/2006/wordprocessingDrawing" xmlns:w10="urn:schemas-microsoft-com:office:word" xmlns:w="http://schemas.openxmlformats.org/wordprocessingml/2006/main" xmlns:w14="http://schemas.microsoft.com/office/word/2010/wordml" xmlns:w15="http://schemas.microsoft.com/office/word/2012/wordml" xmlns:w16cid="http://schemas.microsoft.com/office/word/2016/wordml/cid" xmlns:w16se="http://schemas.microsoft.com/office/word/2015/wordml/symex" xmlns:wpg="http://schemas.microsoft.com/office/word/2010/wordprocessingGroup" xmlns:wpi="http://schemas.microsoft.com/office/word/2010/wordprocessingInk" xmlns:wne="http://schemas.microsoft.com/office/word/2006/wordml" xmlns:wps="http://schemas.microsoft.com/office/word/2010/wordprocessingShape" mc:Ignorable="w14 w15 w16se w16cid wp14">
-  <w:footnote w:type="separator" w:id="-1">
+<w:footnotes xmlns:wpc="http://schemas.microsoft.com/office/word/2010/wordprocessingCanvas" xmlns:mc="http://schemas.openxmlformats.org/markup-compatibility/2006" xmlns:o="urn:schemas-microsoft-com:office:office" xmlns:r="http://schemas.openxmlformats.org/officeDocument/2006/relationships" xmlns:m="http://schemas.openxmlformats.org/officeDocument/2006/math" xmlns:v="urn:schemas-microsoft-com:vml" xmlns:wp14="http://schemas.microsoft.com/office/word/2010/wordprocessingDrawing" xmlns:wp="http://schemas.openxmlformats.org/drawingml/2006/wordprocessingDrawing" xmlns:w="http://schemas.openxmlformats.org/wordprocessingml/2006/main" xmlns:w14="http://schemas.microsoft.com/office/word/2010/wordml" xmlns:w15="http://schemas.microsoft.com/office/word/2012/wordml" xmlns:w10="urn:schemas-microsoft-com:office:word" xmlns:wpg="http://schemas.microsoft.com/office/word/2010/wordprocessingGroup" xmlns:wpi="http://schemas.microsoft.com/office/word/2010/wordprocessingInk" xmlns:wne="http://schemas.microsoft.com/office/word/2006/wordml" xmlns:wps="http://schemas.microsoft.com/office/word/2010/wordprocessingShape" xmlns:wpsCustomData="http://www.wps.cn/officeDocument/2013/wpsCustomData" mc:Ignorable="w14 w15 wp14">
+  <w:footnote w:type="separator" w:id="0">
     <w:p>
       <w:pPr>
-        <w:spacing w:after="0" w:line="240" w:lineRule="auto"/>
+        <w:spacing w:before="0" w:after="0" w:line="276" w:lineRule="auto"/>
       </w:pPr>
       <w:r>
         <w:separator/>
       </w:r>
     </w:p>
   </w:footnote>
-  <w:footnote w:type="continuationSeparator" w:id="0">
+  <w:footnote w:type="continuationSeparator" w:id="1">
     <w:p>
       <w:pPr>
-        <w:spacing w:after="0" w:line="240" w:lineRule="auto"/>
+        <w:spacing w:before="0" w:after="0" w:line="276" w:lineRule="auto"/>
       </w:pPr>
       <w:r>
         <w:continuationSeparator/>
@@ -1838,954 +1934,293 @@
 </w:footnotes>
 </file>
 
-<file path=word/numbering.xml><?xml version="1.0" encoding="utf-8"?>
-<w:numbering xmlns:wpc="http://schemas.microsoft.com/office/word/2010/wordprocessingCanvas" xmlns:cx="http://schemas.microsoft.com/office/drawing/2014/chartex" xmlns:cx1="http://schemas.microsoft.com/office/drawing/2015/9/8/chartex" xmlns:cx2="http://schemas.microsoft.com/office/drawing/2015/10/21/chartex" xmlns:cx3="http://schemas.microsoft.com/office/drawing/2016/5/9/chartex" xmlns:cx4="http://schemas.microsoft.com/office/drawing/2016/5/10/chartex" xmlns:cx5="http://schemas.microsoft.com/office/drawing/2016/5/11/chartex" xmlns:cx6="http://schemas.microsoft.com/office/drawing/2016/5/12/chartex" xmlns:cx7="http://schemas.microsoft.com/office/drawing/2016/5/13/chartex" xmlns:cx8="http://schemas.microsoft.com/office/drawing/2016/5/14/chartex" xmlns:mc="http://schemas.openxmlformats.org/markup-compatibility/2006" xmlns:aink="http://schemas.microsoft.com/office/drawing/2016/ink" xmlns:am3d="http://schemas.microsoft.com/office/drawing/2017/model3d" xmlns:o="urn:schemas-microsoft-com:office:office" xmlns:r="http://schemas.openxmlformats.org/officeDocument/2006/relationships" xmlns:m="http://schemas.openxmlformats.org/officeDocument/2006/math" xmlns:v="urn:schemas-microsoft-com:vml" xmlns:wp14="http://schemas.microsoft.com/office/word/2010/wordprocessingDrawing" xmlns:wp="http://schemas.openxmlformats.org/drawingml/2006/wordprocessingDrawing" xmlns:w10="urn:schemas-microsoft-com:office:word" xmlns:w="http://schemas.openxmlformats.org/wordprocessingml/2006/main" xmlns:w14="http://schemas.microsoft.com/office/word/2010/wordml" xmlns:w15="http://schemas.microsoft.com/office/word/2012/wordml" xmlns:w16cid="http://schemas.microsoft.com/office/word/2016/wordml/cid" xmlns:w16se="http://schemas.microsoft.com/office/word/2015/wordml/symex" xmlns:wpg="http://schemas.microsoft.com/office/word/2010/wordprocessingGroup" xmlns:wpi="http://schemas.microsoft.com/office/word/2010/wordprocessingInk" xmlns:wne="http://schemas.microsoft.com/office/word/2006/wordml" xmlns:wps="http://schemas.microsoft.com/office/word/2010/wordprocessingShape" mc:Ignorable="w14 w15 w16se w16cid wp14">
-  <w:abstractNum w:abstractNumId="0" w15:restartNumberingAfterBreak="0">
-    <w:nsid w:val="07113545"/>
-    <w:multiLevelType w:val="hybridMultilevel"/>
-    <w:tmpl w:val="98A45C16"/>
-    <w:lvl w:ilvl="0" w:tplc="0409000F">
-      <w:start w:val="1"/>
-      <w:numFmt w:val="decimal"/>
-      <w:lvlText w:val="%1."/>
-      <w:lvlJc w:val="left"/>
-      <w:pPr>
-        <w:ind w:left="480" w:hanging="480"/>
-      </w:pPr>
-    </w:lvl>
-    <w:lvl w:ilvl="1" w:tplc="04090019" w:tentative="1">
-      <w:start w:val="1"/>
-      <w:numFmt w:val="ideographTraditional"/>
-      <w:lvlText w:val="%2、"/>
-      <w:lvlJc w:val="left"/>
-      <w:pPr>
-        <w:ind w:left="960" w:hanging="480"/>
-      </w:pPr>
-    </w:lvl>
-    <w:lvl w:ilvl="2" w:tplc="0409001B" w:tentative="1">
-      <w:start w:val="1"/>
-      <w:numFmt w:val="lowerRoman"/>
-      <w:lvlText w:val="%3."/>
-      <w:lvlJc w:val="right"/>
-      <w:pPr>
-        <w:ind w:left="1440" w:hanging="480"/>
-      </w:pPr>
-    </w:lvl>
-    <w:lvl w:ilvl="3" w:tplc="0409000F" w:tentative="1">
-      <w:start w:val="1"/>
-      <w:numFmt w:val="decimal"/>
-      <w:lvlText w:val="%4."/>
-      <w:lvlJc w:val="left"/>
-      <w:pPr>
-        <w:ind w:left="1920" w:hanging="480"/>
-      </w:pPr>
-    </w:lvl>
-    <w:lvl w:ilvl="4" w:tplc="04090019" w:tentative="1">
-      <w:start w:val="1"/>
-      <w:numFmt w:val="ideographTraditional"/>
-      <w:lvlText w:val="%5、"/>
-      <w:lvlJc w:val="left"/>
-      <w:pPr>
-        <w:ind w:left="2400" w:hanging="480"/>
-      </w:pPr>
-    </w:lvl>
-    <w:lvl w:ilvl="5" w:tplc="0409001B" w:tentative="1">
-      <w:start w:val="1"/>
-      <w:numFmt w:val="lowerRoman"/>
-      <w:lvlText w:val="%6."/>
-      <w:lvlJc w:val="right"/>
-      <w:pPr>
-        <w:ind w:left="2880" w:hanging="480"/>
-      </w:pPr>
-    </w:lvl>
-    <w:lvl w:ilvl="6" w:tplc="0409000F" w:tentative="1">
-      <w:start w:val="1"/>
-      <w:numFmt w:val="decimal"/>
-      <w:lvlText w:val="%7."/>
-      <w:lvlJc w:val="left"/>
-      <w:pPr>
-        <w:ind w:left="3360" w:hanging="480"/>
-      </w:pPr>
-    </w:lvl>
-    <w:lvl w:ilvl="7" w:tplc="04090019" w:tentative="1">
-      <w:start w:val="1"/>
-      <w:numFmt w:val="ideographTraditional"/>
-      <w:lvlText w:val="%8、"/>
-      <w:lvlJc w:val="left"/>
-      <w:pPr>
-        <w:ind w:left="3840" w:hanging="480"/>
-      </w:pPr>
-    </w:lvl>
-    <w:lvl w:ilvl="8" w:tplc="0409001B" w:tentative="1">
-      <w:start w:val="1"/>
-      <w:numFmt w:val="lowerRoman"/>
-      <w:lvlText w:val="%9."/>
-      <w:lvlJc w:val="right"/>
-      <w:pPr>
-        <w:ind w:left="4320" w:hanging="480"/>
-      </w:pPr>
-    </w:lvl>
-  </w:abstractNum>
-  <w:abstractNum w:abstractNumId="1" w15:restartNumberingAfterBreak="0">
-    <w:nsid w:val="10291DCC"/>
-    <w:multiLevelType w:val="hybridMultilevel"/>
-    <w:tmpl w:val="84E01614"/>
-    <w:lvl w:ilvl="0" w:tplc="4809000F">
-      <w:start w:val="1"/>
-      <w:numFmt w:val="decimal"/>
-      <w:lvlText w:val="%1."/>
-      <w:lvlJc w:val="left"/>
-      <w:pPr>
-        <w:ind w:left="720" w:hanging="360"/>
-      </w:pPr>
-    </w:lvl>
-    <w:lvl w:ilvl="1" w:tplc="48090019">
-      <w:start w:val="1"/>
-      <w:numFmt w:val="decimal"/>
-      <w:lvlText w:val="%2."/>
-      <w:lvlJc w:val="left"/>
-      <w:pPr>
-        <w:tabs>
-          <w:tab w:val="num" w:pos="1440"/>
-        </w:tabs>
-        <w:ind w:left="1440" w:hanging="360"/>
-      </w:pPr>
-    </w:lvl>
-    <w:lvl w:ilvl="2" w:tplc="4809001B">
-      <w:start w:val="1"/>
-      <w:numFmt w:val="decimal"/>
-      <w:lvlText w:val="%3."/>
-      <w:lvlJc w:val="left"/>
-      <w:pPr>
-        <w:tabs>
-          <w:tab w:val="num" w:pos="2160"/>
-        </w:tabs>
-        <w:ind w:left="2160" w:hanging="360"/>
-      </w:pPr>
-    </w:lvl>
-    <w:lvl w:ilvl="3" w:tplc="4809000F">
-      <w:start w:val="1"/>
-      <w:numFmt w:val="decimal"/>
-      <w:lvlText w:val="%4."/>
-      <w:lvlJc w:val="left"/>
-      <w:pPr>
-        <w:tabs>
-          <w:tab w:val="num" w:pos="2880"/>
-        </w:tabs>
-        <w:ind w:left="2880" w:hanging="360"/>
-      </w:pPr>
-    </w:lvl>
-    <w:lvl w:ilvl="4" w:tplc="48090019">
-      <w:start w:val="1"/>
-      <w:numFmt w:val="decimal"/>
-      <w:lvlText w:val="%5."/>
-      <w:lvlJc w:val="left"/>
-      <w:pPr>
-        <w:tabs>
-          <w:tab w:val="num" w:pos="3600"/>
-        </w:tabs>
-        <w:ind w:left="3600" w:hanging="360"/>
-      </w:pPr>
-    </w:lvl>
-    <w:lvl w:ilvl="5" w:tplc="4809001B">
-      <w:start w:val="1"/>
-      <w:numFmt w:val="decimal"/>
-      <w:lvlText w:val="%6."/>
-      <w:lvlJc w:val="left"/>
-      <w:pPr>
-        <w:tabs>
-          <w:tab w:val="num" w:pos="4320"/>
-        </w:tabs>
-        <w:ind w:left="4320" w:hanging="360"/>
-      </w:pPr>
-    </w:lvl>
-    <w:lvl w:ilvl="6" w:tplc="4809000F">
-      <w:start w:val="1"/>
-      <w:numFmt w:val="decimal"/>
-      <w:lvlText w:val="%7."/>
-      <w:lvlJc w:val="left"/>
-      <w:pPr>
-        <w:tabs>
-          <w:tab w:val="num" w:pos="5040"/>
-        </w:tabs>
-        <w:ind w:left="5040" w:hanging="360"/>
-      </w:pPr>
-    </w:lvl>
-    <w:lvl w:ilvl="7" w:tplc="48090019">
-      <w:start w:val="1"/>
-      <w:numFmt w:val="decimal"/>
-      <w:lvlText w:val="%8."/>
-      <w:lvlJc w:val="left"/>
-      <w:pPr>
-        <w:tabs>
-          <w:tab w:val="num" w:pos="5760"/>
-        </w:tabs>
-        <w:ind w:left="5760" w:hanging="360"/>
-      </w:pPr>
-    </w:lvl>
-    <w:lvl w:ilvl="8" w:tplc="4809001B">
-      <w:start w:val="1"/>
-      <w:numFmt w:val="decimal"/>
-      <w:lvlText w:val="%9."/>
-      <w:lvlJc w:val="left"/>
-      <w:pPr>
-        <w:tabs>
-          <w:tab w:val="num" w:pos="6480"/>
-        </w:tabs>
-        <w:ind w:left="6480" w:hanging="360"/>
-      </w:pPr>
-    </w:lvl>
-  </w:abstractNum>
-  <w:abstractNum w:abstractNumId="2" w15:restartNumberingAfterBreak="0">
-    <w:nsid w:val="23F4133A"/>
-    <w:multiLevelType w:val="hybridMultilevel"/>
-    <w:tmpl w:val="8CB6B306"/>
-    <w:lvl w:ilvl="0" w:tplc="91920600">
-      <w:start w:val="1"/>
-      <w:numFmt w:val="decimal"/>
-      <w:lvlText w:val="%1."/>
-      <w:lvlJc w:val="left"/>
-      <w:pPr>
-        <w:ind w:left="720" w:hanging="360"/>
-      </w:pPr>
-      <w:rPr>
-        <w:rFonts w:hint="eastAsia"/>
-      </w:rPr>
-    </w:lvl>
-    <w:lvl w:ilvl="1" w:tplc="48090019">
-      <w:start w:val="1"/>
-      <w:numFmt w:val="decimal"/>
-      <w:lvlText w:val="%2."/>
-      <w:lvlJc w:val="left"/>
-      <w:pPr>
-        <w:tabs>
-          <w:tab w:val="num" w:pos="1440"/>
-        </w:tabs>
-        <w:ind w:left="1440" w:hanging="360"/>
-      </w:pPr>
-    </w:lvl>
-    <w:lvl w:ilvl="2" w:tplc="4809001B">
-      <w:start w:val="1"/>
-      <w:numFmt w:val="decimal"/>
-      <w:lvlText w:val="%3."/>
-      <w:lvlJc w:val="left"/>
-      <w:pPr>
-        <w:tabs>
-          <w:tab w:val="num" w:pos="2160"/>
-        </w:tabs>
-        <w:ind w:left="2160" w:hanging="360"/>
-      </w:pPr>
-    </w:lvl>
-    <w:lvl w:ilvl="3" w:tplc="4809000F">
-      <w:start w:val="1"/>
-      <w:numFmt w:val="decimal"/>
-      <w:lvlText w:val="%4."/>
-      <w:lvlJc w:val="left"/>
-      <w:pPr>
-        <w:tabs>
-          <w:tab w:val="num" w:pos="2880"/>
-        </w:tabs>
-        <w:ind w:left="2880" w:hanging="360"/>
-      </w:pPr>
-    </w:lvl>
-    <w:lvl w:ilvl="4" w:tplc="48090019">
-      <w:start w:val="1"/>
-      <w:numFmt w:val="decimal"/>
-      <w:lvlText w:val="%5."/>
-      <w:lvlJc w:val="left"/>
-      <w:pPr>
-        <w:tabs>
-          <w:tab w:val="num" w:pos="3600"/>
-        </w:tabs>
-        <w:ind w:left="3600" w:hanging="360"/>
-      </w:pPr>
-    </w:lvl>
-    <w:lvl w:ilvl="5" w:tplc="4809001B">
-      <w:start w:val="1"/>
-      <w:numFmt w:val="decimal"/>
-      <w:lvlText w:val="%6."/>
-      <w:lvlJc w:val="left"/>
-      <w:pPr>
-        <w:tabs>
-          <w:tab w:val="num" w:pos="4320"/>
-        </w:tabs>
-        <w:ind w:left="4320" w:hanging="360"/>
-      </w:pPr>
-    </w:lvl>
-    <w:lvl w:ilvl="6" w:tplc="4809000F">
-      <w:start w:val="1"/>
-      <w:numFmt w:val="decimal"/>
-      <w:lvlText w:val="%7."/>
-      <w:lvlJc w:val="left"/>
-      <w:pPr>
-        <w:tabs>
-          <w:tab w:val="num" w:pos="5040"/>
-        </w:tabs>
-        <w:ind w:left="5040" w:hanging="360"/>
-      </w:pPr>
-    </w:lvl>
-    <w:lvl w:ilvl="7" w:tplc="48090019">
-      <w:start w:val="1"/>
-      <w:numFmt w:val="decimal"/>
-      <w:lvlText w:val="%8."/>
-      <w:lvlJc w:val="left"/>
-      <w:pPr>
-        <w:tabs>
-          <w:tab w:val="num" w:pos="5760"/>
-        </w:tabs>
-        <w:ind w:left="5760" w:hanging="360"/>
-      </w:pPr>
-    </w:lvl>
-    <w:lvl w:ilvl="8" w:tplc="4809001B">
-      <w:start w:val="1"/>
-      <w:numFmt w:val="decimal"/>
-      <w:lvlText w:val="%9."/>
-      <w:lvlJc w:val="left"/>
-      <w:pPr>
-        <w:tabs>
-          <w:tab w:val="num" w:pos="6480"/>
-        </w:tabs>
-        <w:ind w:left="6480" w:hanging="360"/>
-      </w:pPr>
-    </w:lvl>
-  </w:abstractNum>
-  <w:abstractNum w:abstractNumId="3" w15:restartNumberingAfterBreak="0">
-    <w:nsid w:val="2FA22579"/>
-    <w:multiLevelType w:val="hybridMultilevel"/>
-    <w:tmpl w:val="99967B72"/>
-    <w:lvl w:ilvl="0" w:tplc="3CCA7AAA">
-      <w:start w:val="1"/>
-      <w:numFmt w:val="decimal"/>
-      <w:lvlText w:val="%1."/>
-      <w:lvlJc w:val="left"/>
-      <w:pPr>
-        <w:ind w:left="720" w:hanging="360"/>
-      </w:pPr>
-      <w:rPr>
-        <w:rFonts w:hint="eastAsia"/>
-      </w:rPr>
-    </w:lvl>
-    <w:lvl w:ilvl="1" w:tplc="48090019" w:tentative="1">
-      <w:start w:val="1"/>
-      <w:numFmt w:val="lowerLetter"/>
-      <w:lvlText w:val="%2."/>
-      <w:lvlJc w:val="left"/>
-      <w:pPr>
-        <w:ind w:left="1440" w:hanging="360"/>
-      </w:pPr>
-    </w:lvl>
-    <w:lvl w:ilvl="2" w:tplc="4809001B" w:tentative="1">
-      <w:start w:val="1"/>
-      <w:numFmt w:val="lowerRoman"/>
-      <w:lvlText w:val="%3."/>
-      <w:lvlJc w:val="right"/>
-      <w:pPr>
-        <w:ind w:left="2160" w:hanging="180"/>
-      </w:pPr>
-    </w:lvl>
-    <w:lvl w:ilvl="3" w:tplc="4809000F" w:tentative="1">
-      <w:start w:val="1"/>
-      <w:numFmt w:val="decimal"/>
-      <w:lvlText w:val="%4."/>
-      <w:lvlJc w:val="left"/>
-      <w:pPr>
-        <w:ind w:left="2880" w:hanging="360"/>
-      </w:pPr>
-    </w:lvl>
-    <w:lvl w:ilvl="4" w:tplc="48090019" w:tentative="1">
-      <w:start w:val="1"/>
-      <w:numFmt w:val="lowerLetter"/>
-      <w:lvlText w:val="%5."/>
-      <w:lvlJc w:val="left"/>
-      <w:pPr>
-        <w:ind w:left="3600" w:hanging="360"/>
-      </w:pPr>
-    </w:lvl>
-    <w:lvl w:ilvl="5" w:tplc="4809001B" w:tentative="1">
-      <w:start w:val="1"/>
-      <w:numFmt w:val="lowerRoman"/>
-      <w:lvlText w:val="%6."/>
-      <w:lvlJc w:val="right"/>
-      <w:pPr>
-        <w:ind w:left="4320" w:hanging="180"/>
-      </w:pPr>
-    </w:lvl>
-    <w:lvl w:ilvl="6" w:tplc="4809000F" w:tentative="1">
-      <w:start w:val="1"/>
-      <w:numFmt w:val="decimal"/>
-      <w:lvlText w:val="%7."/>
-      <w:lvlJc w:val="left"/>
-      <w:pPr>
-        <w:ind w:left="5040" w:hanging="360"/>
-      </w:pPr>
-    </w:lvl>
-    <w:lvl w:ilvl="7" w:tplc="48090019" w:tentative="1">
-      <w:start w:val="1"/>
-      <w:numFmt w:val="lowerLetter"/>
-      <w:lvlText w:val="%8."/>
-      <w:lvlJc w:val="left"/>
-      <w:pPr>
-        <w:ind w:left="5760" w:hanging="360"/>
-      </w:pPr>
-    </w:lvl>
-    <w:lvl w:ilvl="8" w:tplc="4809001B" w:tentative="1">
-      <w:start w:val="1"/>
-      <w:numFmt w:val="lowerRoman"/>
-      <w:lvlText w:val="%9."/>
-      <w:lvlJc w:val="right"/>
-      <w:pPr>
-        <w:ind w:left="6480" w:hanging="180"/>
-      </w:pPr>
-    </w:lvl>
-  </w:abstractNum>
-  <w:abstractNum w:abstractNumId="4" w15:restartNumberingAfterBreak="0">
-    <w:nsid w:val="5E6C1F29"/>
-    <w:multiLevelType w:val="hybridMultilevel"/>
-    <w:tmpl w:val="24D2F048"/>
-    <w:lvl w:ilvl="0" w:tplc="4809000F">
-      <w:start w:val="1"/>
-      <w:numFmt w:val="decimal"/>
-      <w:lvlText w:val="%1."/>
-      <w:lvlJc w:val="left"/>
-      <w:pPr>
-        <w:ind w:left="720" w:hanging="360"/>
-      </w:pPr>
-    </w:lvl>
-    <w:lvl w:ilvl="1" w:tplc="48090019" w:tentative="1">
-      <w:start w:val="1"/>
-      <w:numFmt w:val="lowerLetter"/>
-      <w:lvlText w:val="%2."/>
-      <w:lvlJc w:val="left"/>
-      <w:pPr>
-        <w:ind w:left="1440" w:hanging="360"/>
-      </w:pPr>
-    </w:lvl>
-    <w:lvl w:ilvl="2" w:tplc="4809001B" w:tentative="1">
-      <w:start w:val="1"/>
-      <w:numFmt w:val="lowerRoman"/>
-      <w:lvlText w:val="%3."/>
-      <w:lvlJc w:val="right"/>
-      <w:pPr>
-        <w:ind w:left="2160" w:hanging="180"/>
-      </w:pPr>
-    </w:lvl>
-    <w:lvl w:ilvl="3" w:tplc="4809000F" w:tentative="1">
-      <w:start w:val="1"/>
-      <w:numFmt w:val="decimal"/>
-      <w:lvlText w:val="%4."/>
-      <w:lvlJc w:val="left"/>
-      <w:pPr>
-        <w:ind w:left="2880" w:hanging="360"/>
-      </w:pPr>
-    </w:lvl>
-    <w:lvl w:ilvl="4" w:tplc="48090019" w:tentative="1">
-      <w:start w:val="1"/>
-      <w:numFmt w:val="lowerLetter"/>
-      <w:lvlText w:val="%5."/>
-      <w:lvlJc w:val="left"/>
-      <w:pPr>
-        <w:ind w:left="3600" w:hanging="360"/>
-      </w:pPr>
-    </w:lvl>
-    <w:lvl w:ilvl="5" w:tplc="4809001B" w:tentative="1">
-      <w:start w:val="1"/>
-      <w:numFmt w:val="lowerRoman"/>
-      <w:lvlText w:val="%6."/>
-      <w:lvlJc w:val="right"/>
-      <w:pPr>
-        <w:ind w:left="4320" w:hanging="180"/>
-      </w:pPr>
-    </w:lvl>
-    <w:lvl w:ilvl="6" w:tplc="4809000F" w:tentative="1">
-      <w:start w:val="1"/>
-      <w:numFmt w:val="decimal"/>
-      <w:lvlText w:val="%7."/>
-      <w:lvlJc w:val="left"/>
-      <w:pPr>
-        <w:ind w:left="5040" w:hanging="360"/>
-      </w:pPr>
-    </w:lvl>
-    <w:lvl w:ilvl="7" w:tplc="48090019" w:tentative="1">
-      <w:start w:val="1"/>
-      <w:numFmt w:val="lowerLetter"/>
-      <w:lvlText w:val="%8."/>
-      <w:lvlJc w:val="left"/>
-      <w:pPr>
-        <w:ind w:left="5760" w:hanging="360"/>
-      </w:pPr>
-    </w:lvl>
-    <w:lvl w:ilvl="8" w:tplc="4809001B" w:tentative="1">
-      <w:start w:val="1"/>
-      <w:numFmt w:val="lowerRoman"/>
-      <w:lvlText w:val="%9."/>
-      <w:lvlJc w:val="right"/>
-      <w:pPr>
-        <w:ind w:left="6480" w:hanging="180"/>
-      </w:pPr>
-    </w:lvl>
-  </w:abstractNum>
-  <w:num w:numId="1">
-    <w:abstractNumId w:val="1"/>
-    <w:lvlOverride w:ilvl="0">
-      <w:startOverride w:val="1"/>
-    </w:lvlOverride>
-    <w:lvlOverride w:ilvl="1">
-      <w:startOverride w:val="1"/>
-    </w:lvlOverride>
-    <w:lvlOverride w:ilvl="2">
-      <w:startOverride w:val="1"/>
-    </w:lvlOverride>
-    <w:lvlOverride w:ilvl="3">
-      <w:startOverride w:val="1"/>
-    </w:lvlOverride>
-    <w:lvlOverride w:ilvl="4">
-      <w:startOverride w:val="1"/>
-    </w:lvlOverride>
-    <w:lvlOverride w:ilvl="5">
-      <w:startOverride w:val="1"/>
-    </w:lvlOverride>
-    <w:lvlOverride w:ilvl="6">
-      <w:startOverride w:val="1"/>
-    </w:lvlOverride>
-    <w:lvlOverride w:ilvl="7">
-      <w:startOverride w:val="1"/>
-    </w:lvlOverride>
-    <w:lvlOverride w:ilvl="8">
-      <w:startOverride w:val="1"/>
-    </w:lvlOverride>
-  </w:num>
-  <w:num w:numId="2">
-    <w:abstractNumId w:val="2"/>
-  </w:num>
-  <w:num w:numId="3">
-    <w:abstractNumId w:val="1"/>
-  </w:num>
-  <w:num w:numId="4">
-    <w:abstractNumId w:val="4"/>
-  </w:num>
-  <w:num w:numId="5">
-    <w:abstractNumId w:val="3"/>
-  </w:num>
-  <w:num w:numId="6">
-    <w:abstractNumId w:val="0"/>
-  </w:num>
-</w:numbering>
-</file>
-
 <file path=word/styles.xml><?xml version="1.0" encoding="utf-8"?>
-<w:styles xmlns:mc="http://schemas.openxmlformats.org/markup-compatibility/2006" xmlns:r="http://schemas.openxmlformats.org/officeDocument/2006/relationships" xmlns:w="http://schemas.openxmlformats.org/wordprocessingml/2006/main" xmlns:w14="http://schemas.microsoft.com/office/word/2010/wordml" xmlns:w15="http://schemas.microsoft.com/office/word/2012/wordml" xmlns:w16cid="http://schemas.microsoft.com/office/word/2016/wordml/cid" xmlns:w16se="http://schemas.microsoft.com/office/word/2015/wordml/symex" mc:Ignorable="w14 w15 w16se w16cid">
+<w:styles xmlns:mc="http://schemas.openxmlformats.org/markup-compatibility/2006" xmlns:o="urn:schemas-microsoft-com:office:office" xmlns:r="http://schemas.openxmlformats.org/officeDocument/2006/relationships" xmlns:m="http://schemas.openxmlformats.org/officeDocument/2006/math" xmlns:v="urn:schemas-microsoft-com:vml" xmlns:w="http://schemas.openxmlformats.org/wordprocessingml/2006/main" xmlns:w14="http://schemas.microsoft.com/office/word/2010/wordml" xmlns:w10="urn:schemas-microsoft-com:office:word" xmlns:sl="http://schemas.openxmlformats.org/schemaLibrary/2006/main" xmlns:wpsCustomData="http://www.wps.cn/officeDocument/2013/wpsCustomData" mc:Ignorable="w14">
   <w:docDefaults>
     <w:rPrDefault>
       <w:rPr>
-        <w:rFonts w:asciiTheme="minorHAnsi" w:eastAsiaTheme="minorEastAsia" w:hAnsiTheme="minorHAnsi" w:cstheme="minorBidi"/>
-        <w:sz w:val="22"/>
-        <w:szCs w:val="22"/>
-        <w:lang w:val="en-SG" w:eastAsia="zh-CN" w:bidi="ar-SA"/>
+        <w:rFonts w:asciiTheme="minorHAnsi" w:hAnsiTheme="minorHAnsi" w:eastAsiaTheme="minorEastAsia" w:cstheme="minorBidi"/>
       </w:rPr>
     </w:rPrDefault>
-    <w:pPrDefault>
-      <w:pPr>
-        <w:spacing w:after="200" w:line="276" w:lineRule="auto"/>
-      </w:pPr>
-    </w:pPrDefault>
+    <w:pPrDefault/>
   </w:docDefaults>
-  <w:latentStyles w:defLockedState="0" w:defUIPriority="99" w:defSemiHidden="0" w:defUnhideWhenUsed="0" w:defQFormat="0" w:count="375">
-    <w:lsdException w:name="Normal" w:uiPriority="0" w:qFormat="1"/>
-    <w:lsdException w:name="heading 1" w:uiPriority="9" w:qFormat="1"/>
-    <w:lsdException w:name="heading 2" w:semiHidden="1" w:uiPriority="9" w:unhideWhenUsed="1" w:qFormat="1"/>
-    <w:lsdException w:name="heading 3" w:semiHidden="1" w:uiPriority="9" w:unhideWhenUsed="1" w:qFormat="1"/>
-    <w:lsdException w:name="heading 4" w:semiHidden="1" w:uiPriority="9" w:unhideWhenUsed="1" w:qFormat="1"/>
-    <w:lsdException w:name="heading 5" w:semiHidden="1" w:uiPriority="9" w:unhideWhenUsed="1" w:qFormat="1"/>
-    <w:lsdException w:name="heading 6" w:semiHidden="1" w:uiPriority="9" w:unhideWhenUsed="1" w:qFormat="1"/>
-    <w:lsdException w:name="heading 7" w:semiHidden="1" w:uiPriority="9" w:unhideWhenUsed="1" w:qFormat="1"/>
-    <w:lsdException w:name="heading 8" w:semiHidden="1" w:uiPriority="9" w:unhideWhenUsed="1" w:qFormat="1"/>
-    <w:lsdException w:name="heading 9" w:semiHidden="1" w:uiPriority="9" w:unhideWhenUsed="1" w:qFormat="1"/>
-    <w:lsdException w:name="index 1" w:semiHidden="1" w:unhideWhenUsed="1"/>
-    <w:lsdException w:name="index 2" w:semiHidden="1" w:unhideWhenUsed="1"/>
-    <w:lsdException w:name="index 3" w:semiHidden="1" w:unhideWhenUsed="1"/>
-    <w:lsdException w:name="index 4" w:semiHidden="1" w:unhideWhenUsed="1"/>
-    <w:lsdException w:name="index 5" w:semiHidden="1" w:unhideWhenUsed="1"/>
-    <w:lsdException w:name="index 6" w:semiHidden="1" w:unhideWhenUsed="1"/>
-    <w:lsdException w:name="index 7" w:semiHidden="1" w:unhideWhenUsed="1"/>
-    <w:lsdException w:name="index 8" w:semiHidden="1" w:unhideWhenUsed="1"/>
-    <w:lsdException w:name="index 9" w:semiHidden="1" w:unhideWhenUsed="1"/>
-    <w:lsdException w:name="toc 1" w:semiHidden="1" w:uiPriority="39" w:unhideWhenUsed="1"/>
-    <w:lsdException w:name="toc 2" w:semiHidden="1" w:uiPriority="39" w:unhideWhenUsed="1"/>
-    <w:lsdException w:name="toc 3" w:semiHidden="1" w:uiPriority="39" w:unhideWhenUsed="1"/>
-    <w:lsdException w:name="toc 4" w:semiHidden="1" w:uiPriority="39" w:unhideWhenUsed="1"/>
-    <w:lsdException w:name="toc 5" w:semiHidden="1" w:uiPriority="39" w:unhideWhenUsed="1"/>
-    <w:lsdException w:name="toc 6" w:semiHidden="1" w:uiPriority="39" w:unhideWhenUsed="1"/>
-    <w:lsdException w:name="toc 7" w:semiHidden="1" w:uiPriority="39" w:unhideWhenUsed="1"/>
-    <w:lsdException w:name="toc 8" w:semiHidden="1" w:uiPriority="39" w:unhideWhenUsed="1"/>
-    <w:lsdException w:name="toc 9" w:semiHidden="1" w:uiPriority="39" w:unhideWhenUsed="1"/>
-    <w:lsdException w:name="Normal Indent" w:semiHidden="1" w:unhideWhenUsed="1"/>
-    <w:lsdException w:name="footnote text" w:semiHidden="1" w:unhideWhenUsed="1"/>
-    <w:lsdException w:name="annotation text" w:semiHidden="1" w:unhideWhenUsed="1"/>
-    <w:lsdException w:name="header" w:semiHidden="1" w:unhideWhenUsed="1"/>
-    <w:lsdException w:name="footer" w:semiHidden="1" w:unhideWhenUsed="1"/>
-    <w:lsdException w:name="index heading" w:semiHidden="1" w:unhideWhenUsed="1"/>
-    <w:lsdException w:name="caption" w:semiHidden="1" w:uiPriority="35" w:unhideWhenUsed="1" w:qFormat="1"/>
-    <w:lsdException w:name="table of figures" w:semiHidden="1" w:unhideWhenUsed="1"/>
-    <w:lsdException w:name="envelope address" w:semiHidden="1" w:unhideWhenUsed="1"/>
-    <w:lsdException w:name="envelope return" w:semiHidden="1" w:unhideWhenUsed="1"/>
-    <w:lsdException w:name="footnote reference" w:semiHidden="1" w:unhideWhenUsed="1"/>
-    <w:lsdException w:name="annotation reference" w:semiHidden="1" w:unhideWhenUsed="1"/>
-    <w:lsdException w:name="line number" w:semiHidden="1" w:unhideWhenUsed="1"/>
-    <w:lsdException w:name="page number" w:semiHidden="1" w:unhideWhenUsed="1"/>
-    <w:lsdException w:name="endnote reference" w:semiHidden="1" w:unhideWhenUsed="1"/>
-    <w:lsdException w:name="endnote text" w:semiHidden="1" w:unhideWhenUsed="1"/>
-    <w:lsdException w:name="table of authorities" w:semiHidden="1" w:unhideWhenUsed="1"/>
-    <w:lsdException w:name="macro" w:semiHidden="1" w:unhideWhenUsed="1"/>
-    <w:lsdException w:name="toa heading" w:semiHidden="1" w:unhideWhenUsed="1"/>
-    <w:lsdException w:name="List" w:semiHidden="1" w:unhideWhenUsed="1"/>
-    <w:lsdException w:name="List Bullet" w:semiHidden="1" w:unhideWhenUsed="1"/>
-    <w:lsdException w:name="List Number" w:semiHidden="1" w:unhideWhenUsed="1"/>
-    <w:lsdException w:name="List 2" w:semiHidden="1" w:unhideWhenUsed="1"/>
-    <w:lsdException w:name="List 3" w:semiHidden="1" w:unhideWhenUsed="1"/>
-    <w:lsdException w:name="List 4" w:semiHidden="1" w:unhideWhenUsed="1"/>
-    <w:lsdException w:name="List 5" w:semiHidden="1" w:unhideWhenUsed="1"/>
-    <w:lsdException w:name="List Bullet 2" w:semiHidden="1" w:unhideWhenUsed="1"/>
-    <w:lsdException w:name="List Bullet 3" w:semiHidden="1" w:unhideWhenUsed="1"/>
-    <w:lsdException w:name="List Bullet 4" w:semiHidden="1" w:unhideWhenUsed="1"/>
-    <w:lsdException w:name="List Bullet 5" w:semiHidden="1" w:unhideWhenUsed="1"/>
-    <w:lsdException w:name="List Number 2" w:semiHidden="1" w:unhideWhenUsed="1"/>
-    <w:lsdException w:name="List Number 3" w:semiHidden="1" w:unhideWhenUsed="1"/>
-    <w:lsdException w:name="List Number 4" w:semiHidden="1" w:unhideWhenUsed="1"/>
-    <w:lsdException w:name="List Number 5" w:semiHidden="1" w:unhideWhenUsed="1"/>
-    <w:lsdException w:name="Title" w:uiPriority="10" w:qFormat="1"/>
-    <w:lsdException w:name="Closing" w:semiHidden="1" w:unhideWhenUsed="1"/>
-    <w:lsdException w:name="Signature" w:semiHidden="1" w:unhideWhenUsed="1"/>
-    <w:lsdException w:name="Default Paragraph Font" w:semiHidden="1" w:uiPriority="1" w:unhideWhenUsed="1"/>
-    <w:lsdException w:name="Body Text" w:semiHidden="1" w:unhideWhenUsed="1"/>
-    <w:lsdException w:name="Body Text Indent" w:semiHidden="1" w:unhideWhenUsed="1"/>
-    <w:lsdException w:name="List Continue" w:semiHidden="1" w:unhideWhenUsed="1"/>
-    <w:lsdException w:name="List Continue 2" w:semiHidden="1" w:unhideWhenUsed="1"/>
-    <w:lsdException w:name="List Continue 3" w:semiHidden="1" w:unhideWhenUsed="1"/>
-    <w:lsdException w:name="List Continue 4" w:semiHidden="1" w:unhideWhenUsed="1"/>
-    <w:lsdException w:name="List Continue 5" w:semiHidden="1" w:unhideWhenUsed="1"/>
-    <w:lsdException w:name="Message Header" w:semiHidden="1" w:unhideWhenUsed="1"/>
-    <w:lsdException w:name="Subtitle" w:uiPriority="11" w:qFormat="1"/>
-    <w:lsdException w:name="Salutation" w:semiHidden="1" w:unhideWhenUsed="1"/>
-    <w:lsdException w:name="Date" w:semiHidden="1" w:unhideWhenUsed="1"/>
-    <w:lsdException w:name="Body Text First Indent" w:semiHidden="1" w:unhideWhenUsed="1"/>
-    <w:lsdException w:name="Body Text First Indent 2" w:semiHidden="1" w:unhideWhenUsed="1"/>
-    <w:lsdException w:name="Note Heading" w:semiHidden="1" w:unhideWhenUsed="1"/>
-    <w:lsdException w:name="Body Text 2" w:semiHidden="1" w:unhideWhenUsed="1"/>
-    <w:lsdException w:name="Body Text 3" w:semiHidden="1" w:unhideWhenUsed="1"/>
-    <w:lsdException w:name="Body Text Indent 2" w:semiHidden="1" w:unhideWhenUsed="1"/>
-    <w:lsdException w:name="Body Text Indent 3" w:semiHidden="1" w:unhideWhenUsed="1"/>
-    <w:lsdException w:name="Block Text" w:semiHidden="1" w:unhideWhenUsed="1"/>
-    <w:lsdException w:name="Hyperlink" w:semiHidden="1" w:unhideWhenUsed="1"/>
-    <w:lsdException w:name="FollowedHyperlink" w:semiHidden="1" w:unhideWhenUsed="1"/>
-    <w:lsdException w:name="Strong" w:uiPriority="22" w:qFormat="1"/>
-    <w:lsdException w:name="Emphasis" w:uiPriority="20" w:qFormat="1"/>
-    <w:lsdException w:name="Document Map" w:semiHidden="1" w:unhideWhenUsed="1"/>
-    <w:lsdException w:name="Plain Text" w:semiHidden="1" w:unhideWhenUsed="1"/>
-    <w:lsdException w:name="E-mail Signature" w:semiHidden="1" w:unhideWhenUsed="1"/>
-    <w:lsdException w:name="HTML Top of Form" w:semiHidden="1" w:unhideWhenUsed="1"/>
-    <w:lsdException w:name="HTML Bottom of Form" w:semiHidden="1" w:unhideWhenUsed="1"/>
-    <w:lsdException w:name="Normal (Web)" w:semiHidden="1" w:unhideWhenUsed="1"/>
-    <w:lsdException w:name="HTML Acronym" w:semiHidden="1" w:unhideWhenUsed="1"/>
-    <w:lsdException w:name="HTML Address" w:semiHidden="1" w:unhideWhenUsed="1"/>
-    <w:lsdException w:name="HTML Cite" w:semiHidden="1" w:unhideWhenUsed="1"/>
-    <w:lsdException w:name="HTML Code" w:semiHidden="1" w:unhideWhenUsed="1"/>
-    <w:lsdException w:name="HTML Definition" w:semiHidden="1" w:unhideWhenUsed="1"/>
-    <w:lsdException w:name="HTML Keyboard" w:semiHidden="1" w:unhideWhenUsed="1"/>
-    <w:lsdException w:name="HTML Preformatted" w:semiHidden="1" w:unhideWhenUsed="1"/>
-    <w:lsdException w:name="HTML Sample" w:semiHidden="1" w:unhideWhenUsed="1"/>
-    <w:lsdException w:name="HTML Typewriter" w:semiHidden="1" w:unhideWhenUsed="1"/>
-    <w:lsdException w:name="HTML Variable" w:semiHidden="1" w:unhideWhenUsed="1"/>
-    <w:lsdException w:name="Normal Table" w:semiHidden="1" w:unhideWhenUsed="1"/>
-    <w:lsdException w:name="annotation subject" w:semiHidden="1" w:unhideWhenUsed="1"/>
-    <w:lsdException w:name="No List" w:semiHidden="1" w:unhideWhenUsed="1"/>
-    <w:lsdException w:name="Outline List 1" w:semiHidden="1" w:unhideWhenUsed="1"/>
-    <w:lsdException w:name="Outline List 2" w:semiHidden="1" w:unhideWhenUsed="1"/>
-    <w:lsdException w:name="Outline List 3" w:semiHidden="1" w:unhideWhenUsed="1"/>
-    <w:lsdException w:name="Table Simple 1" w:semiHidden="1" w:unhideWhenUsed="1"/>
-    <w:lsdException w:name="Table Simple 2" w:semiHidden="1" w:unhideWhenUsed="1"/>
-    <w:lsdException w:name="Table Simple 3" w:semiHidden="1" w:unhideWhenUsed="1"/>
-    <w:lsdException w:name="Table Classic 1" w:semiHidden="1" w:unhideWhenUsed="1"/>
-    <w:lsdException w:name="Table Classic 2" w:semiHidden="1" w:unhideWhenUsed="1"/>
-    <w:lsdException w:name="Table Classic 3" w:semiHidden="1" w:unhideWhenUsed="1"/>
-    <w:lsdException w:name="Table Classic 4" w:semiHidden="1" w:unhideWhenUsed="1"/>
-    <w:lsdException w:name="Table Colorful 1" w:semiHidden="1" w:unhideWhenUsed="1"/>
-    <w:lsdException w:name="Table Colorful 2" w:semiHidden="1" w:unhideWhenUsed="1"/>
-    <w:lsdException w:name="Table Colorful 3" w:semiHidden="1" w:unhideWhenUsed="1"/>
-    <w:lsdException w:name="Table Columns 1" w:semiHidden="1" w:unhideWhenUsed="1"/>
-    <w:lsdException w:name="Table Columns 2" w:semiHidden="1" w:unhideWhenUsed="1"/>
-    <w:lsdException w:name="Table Columns 3" w:semiHidden="1" w:unhideWhenUsed="1"/>
-    <w:lsdException w:name="Table Columns 4" w:semiHidden="1" w:unhideWhenUsed="1"/>
-    <w:lsdException w:name="Table Columns 5" w:semiHidden="1" w:unhideWhenUsed="1"/>
-    <w:lsdException w:name="Table Grid 1" w:semiHidden="1" w:unhideWhenUsed="1"/>
-    <w:lsdException w:name="Table Grid 2" w:semiHidden="1" w:unhideWhenUsed="1"/>
-    <w:lsdException w:name="Table Grid 3" w:semiHidden="1" w:unhideWhenUsed="1"/>
-    <w:lsdException w:name="Table Grid 4" w:semiHidden="1" w:unhideWhenUsed="1"/>
-    <w:lsdException w:name="Table Grid 5" w:semiHidden="1" w:unhideWhenUsed="1"/>
-    <w:lsdException w:name="Table Grid 6" w:semiHidden="1" w:unhideWhenUsed="1"/>
-    <w:lsdException w:name="Table Grid 7" w:semiHidden="1" w:unhideWhenUsed="1"/>
-    <w:lsdException w:name="Table Grid 8" w:semiHidden="1" w:unhideWhenUsed="1"/>
-    <w:lsdException w:name="Table List 1" w:semiHidden="1" w:unhideWhenUsed="1"/>
-    <w:lsdException w:name="Table List 2" w:semiHidden="1" w:unhideWhenUsed="1"/>
-    <w:lsdException w:name="Table List 3" w:semiHidden="1" w:unhideWhenUsed="1"/>
-    <w:lsdException w:name="Table List 4" w:semiHidden="1" w:unhideWhenUsed="1"/>
-    <w:lsdException w:name="Table List 5" w:semiHidden="1" w:unhideWhenUsed="1"/>
-    <w:lsdException w:name="Table List 6" w:semiHidden="1" w:unhideWhenUsed="1"/>
-    <w:lsdException w:name="Table List 7" w:semiHidden="1" w:unhideWhenUsed="1"/>
-    <w:lsdException w:name="Table List 8" w:semiHidden="1" w:unhideWhenUsed="1"/>
-    <w:lsdException w:name="Table 3D effects 1" w:semiHidden="1" w:unhideWhenUsed="1"/>
-    <w:lsdException w:name="Table 3D effects 2" w:semiHidden="1" w:unhideWhenUsed="1"/>
-    <w:lsdException w:name="Table 3D effects 3" w:semiHidden="1" w:unhideWhenUsed="1"/>
-    <w:lsdException w:name="Table Contemporary" w:semiHidden="1" w:unhideWhenUsed="1"/>
-    <w:lsdException w:name="Table Elegant" w:semiHidden="1" w:unhideWhenUsed="1"/>
-    <w:lsdException w:name="Table Professional" w:semiHidden="1" w:unhideWhenUsed="1"/>
-    <w:lsdException w:name="Table Subtle 1" w:semiHidden="1" w:unhideWhenUsed="1"/>
-    <w:lsdException w:name="Table Subtle 2" w:semiHidden="1" w:unhideWhenUsed="1"/>
-    <w:lsdException w:name="Table Web 1" w:semiHidden="1" w:unhideWhenUsed="1"/>
-    <w:lsdException w:name="Table Web 2" w:semiHidden="1" w:unhideWhenUsed="1"/>
-    <w:lsdException w:name="Table Web 3" w:semiHidden="1" w:unhideWhenUsed="1"/>
-    <w:lsdException w:name="Balloon Text" w:semiHidden="1" w:unhideWhenUsed="1"/>
-    <w:lsdException w:name="Table Grid" w:uiPriority="59"/>
-    <w:lsdException w:name="Table Theme" w:semiHidden="1" w:unhideWhenUsed="1"/>
-    <w:lsdException w:name="Placeholder Text" w:semiHidden="1"/>
-    <w:lsdException w:name="No Spacing" w:uiPriority="1" w:qFormat="1"/>
-    <w:lsdException w:name="Light Shading" w:uiPriority="60"/>
-    <w:lsdException w:name="Light List" w:uiPriority="61"/>
-    <w:lsdException w:name="Light Grid" w:uiPriority="62"/>
-    <w:lsdException w:name="Medium Shading 1" w:uiPriority="63"/>
-    <w:lsdException w:name="Medium Shading 2" w:uiPriority="64"/>
-    <w:lsdException w:name="Medium List 1" w:uiPriority="65"/>
-    <w:lsdException w:name="Medium List 2" w:uiPriority="66"/>
-    <w:lsdException w:name="Medium Grid 1" w:uiPriority="67"/>
-    <w:lsdException w:name="Medium Grid 2" w:uiPriority="68"/>
-    <w:lsdException w:name="Medium Grid 3" w:uiPriority="69"/>
-    <w:lsdException w:name="Dark List" w:uiPriority="70"/>
-    <w:lsdException w:name="Colorful Shading" w:uiPriority="71"/>
-    <w:lsdException w:name="Colorful List" w:uiPriority="72"/>
-    <w:lsdException w:name="Colorful Grid" w:uiPriority="73"/>
-    <w:lsdException w:name="Light Shading Accent 1" w:uiPriority="60"/>
-    <w:lsdException w:name="Light List Accent 1" w:uiPriority="61"/>
-    <w:lsdException w:name="Light Grid Accent 1" w:uiPriority="62"/>
-    <w:lsdException w:name="Medium Shading 1 Accent 1" w:uiPriority="63"/>
-    <w:lsdException w:name="Medium Shading 2 Accent 1" w:uiPriority="64"/>
-    <w:lsdException w:name="Medium List 1 Accent 1" w:uiPriority="65"/>
-    <w:lsdException w:name="Revision" w:semiHidden="1"/>
-    <w:lsdException w:name="List Paragraph" w:uiPriority="34" w:qFormat="1"/>
-    <w:lsdException w:name="Quote" w:uiPriority="29" w:qFormat="1"/>
-    <w:lsdException w:name="Intense Quote" w:uiPriority="30" w:qFormat="1"/>
-    <w:lsdException w:name="Medium List 2 Accent 1" w:uiPriority="66"/>
-    <w:lsdException w:name="Medium Grid 1 Accent 1" w:uiPriority="67"/>
-    <w:lsdException w:name="Medium Grid 2 Accent 1" w:uiPriority="68"/>
-    <w:lsdException w:name="Medium Grid 3 Accent 1" w:uiPriority="69"/>
-    <w:lsdException w:name="Dark List Accent 1" w:uiPriority="70"/>
-    <w:lsdException w:name="Colorful Shading Accent 1" w:uiPriority="71"/>
-    <w:lsdException w:name="Colorful List Accent 1" w:uiPriority="72"/>
-    <w:lsdException w:name="Colorful Grid Accent 1" w:uiPriority="73"/>
-    <w:lsdException w:name="Light Shading Accent 2" w:uiPriority="60"/>
-    <w:lsdException w:name="Light List Accent 2" w:uiPriority="61"/>
-    <w:lsdException w:name="Light Grid Accent 2" w:uiPriority="62"/>
-    <w:lsdException w:name="Medium Shading 1 Accent 2" w:uiPriority="63"/>
-    <w:lsdException w:name="Medium Shading 2 Accent 2" w:uiPriority="64"/>
-    <w:lsdException w:name="Medium List 1 Accent 2" w:uiPriority="65"/>
-    <w:lsdException w:name="Medium List 2 Accent 2" w:uiPriority="66"/>
-    <w:lsdException w:name="Medium Grid 1 Accent 2" w:uiPriority="67"/>
-    <w:lsdException w:name="Medium Grid 2 Accent 2" w:uiPriority="68"/>
-    <w:lsdException w:name="Medium Grid 3 Accent 2" w:uiPriority="69"/>
-    <w:lsdException w:name="Dark List Accent 2" w:uiPriority="70"/>
-    <w:lsdException w:name="Colorful Shading Accent 2" w:uiPriority="71"/>
-    <w:lsdException w:name="Colorful List Accent 2" w:uiPriority="72"/>
-    <w:lsdException w:name="Colorful Grid Accent 2" w:uiPriority="73"/>
-    <w:lsdException w:name="Light Shading Accent 3" w:uiPriority="60"/>
-    <w:lsdException w:name="Light List Accent 3" w:uiPriority="61"/>
-    <w:lsdException w:name="Light Grid Accent 3" w:uiPriority="62"/>
-    <w:lsdException w:name="Medium Shading 1 Accent 3" w:uiPriority="63"/>
-    <w:lsdException w:name="Medium Shading 2 Accent 3" w:uiPriority="64"/>
-    <w:lsdException w:name="Medium List 1 Accent 3" w:uiPriority="65"/>
-    <w:lsdException w:name="Medium List 2 Accent 3" w:uiPriority="66"/>
-    <w:lsdException w:name="Medium Grid 1 Accent 3" w:uiPriority="67"/>
-    <w:lsdException w:name="Medium Grid 2 Accent 3" w:uiPriority="68"/>
-    <w:lsdException w:name="Medium Grid 3 Accent 3" w:uiPriority="69"/>
-    <w:lsdException w:name="Dark List Accent 3" w:uiPriority="70"/>
-    <w:lsdException w:name="Colorful Shading Accent 3" w:uiPriority="71"/>
-    <w:lsdException w:name="Colorful List Accent 3" w:uiPriority="72"/>
-    <w:lsdException w:name="Colorful Grid Accent 3" w:uiPriority="73"/>
-    <w:lsdException w:name="Light Shading Accent 4" w:uiPriority="60"/>
-    <w:lsdException w:name="Light List Accent 4" w:uiPriority="61"/>
-    <w:lsdException w:name="Light Grid Accent 4" w:uiPriority="62"/>
-    <w:lsdException w:name="Medium Shading 1 Accent 4" w:uiPriority="63"/>
-    <w:lsdException w:name="Medium Shading 2 Accent 4" w:uiPriority="64"/>
-    <w:lsdException w:name="Medium List 1 Accent 4" w:uiPriority="65"/>
-    <w:lsdException w:name="Medium List 2 Accent 4" w:uiPriority="66"/>
-    <w:lsdException w:name="Medium Grid 1 Accent 4" w:uiPriority="67"/>
-    <w:lsdException w:name="Medium Grid 2 Accent 4" w:uiPriority="68"/>
-    <w:lsdException w:name="Medium Grid 3 Accent 4" w:uiPriority="69"/>
-    <w:lsdException w:name="Dark List Accent 4" w:uiPriority="70"/>
-    <w:lsdException w:name="Colorful Shading Accent 4" w:uiPriority="71"/>
-    <w:lsdException w:name="Colorful List Accent 4" w:uiPriority="72"/>
-    <w:lsdException w:name="Colorful Grid Accent 4" w:uiPriority="73"/>
-    <w:lsdException w:name="Light Shading Accent 5" w:uiPriority="60"/>
-    <w:lsdException w:name="Light List Accent 5" w:uiPriority="61"/>
-    <w:lsdException w:name="Light Grid Accent 5" w:uiPriority="62"/>
-    <w:lsdException w:name="Medium Shading 1 Accent 5" w:uiPriority="63"/>
-    <w:lsdException w:name="Medium Shading 2 Accent 5" w:uiPriority="64"/>
-    <w:lsdException w:name="Medium List 1 Accent 5" w:uiPriority="65"/>
-    <w:lsdException w:name="Medium List 2 Accent 5" w:uiPriority="66"/>
-    <w:lsdException w:name="Medium Grid 1 Accent 5" w:uiPriority="67"/>
-    <w:lsdException w:name="Medium Grid 2 Accent 5" w:uiPriority="68"/>
-    <w:lsdException w:name="Medium Grid 3 Accent 5" w:uiPriority="69"/>
-    <w:lsdException w:name="Dark List Accent 5" w:uiPriority="70"/>
-    <w:lsdException w:name="Colorful Shading Accent 5" w:uiPriority="71"/>
-    <w:lsdException w:name="Colorful List Accent 5" w:uiPriority="72"/>
-    <w:lsdException w:name="Colorful Grid Accent 5" w:uiPriority="73"/>
-    <w:lsdException w:name="Light Shading Accent 6" w:uiPriority="60"/>
-    <w:lsdException w:name="Light List Accent 6" w:uiPriority="61"/>
-    <w:lsdException w:name="Light Grid Accent 6" w:uiPriority="62"/>
-    <w:lsdException w:name="Medium Shading 1 Accent 6" w:uiPriority="63"/>
-    <w:lsdException w:name="Medium Shading 2 Accent 6" w:uiPriority="64"/>
-    <w:lsdException w:name="Medium List 1 Accent 6" w:uiPriority="65"/>
-    <w:lsdException w:name="Medium List 2 Accent 6" w:uiPriority="66"/>
-    <w:lsdException w:name="Medium Grid 1 Accent 6" w:uiPriority="67"/>
-    <w:lsdException w:name="Medium Grid 2 Accent 6" w:uiPriority="68"/>
-    <w:lsdException w:name="Medium Grid 3 Accent 6" w:uiPriority="69"/>
-    <w:lsdException w:name="Dark List Accent 6" w:uiPriority="70"/>
-    <w:lsdException w:name="Colorful Shading Accent 6" w:uiPriority="71"/>
-    <w:lsdException w:name="Colorful List Accent 6" w:uiPriority="72"/>
-    <w:lsdException w:name="Colorful Grid Accent 6" w:uiPriority="73"/>
-    <w:lsdException w:name="Subtle Emphasis" w:uiPriority="19" w:qFormat="1"/>
-    <w:lsdException w:name="Intense Emphasis" w:uiPriority="21" w:qFormat="1"/>
-    <w:lsdException w:name="Subtle Reference" w:uiPriority="31" w:qFormat="1"/>
-    <w:lsdException w:name="Intense Reference" w:uiPriority="32" w:qFormat="1"/>
-    <w:lsdException w:name="Book Title" w:uiPriority="33" w:qFormat="1"/>
-    <w:lsdException w:name="Bibliography" w:semiHidden="1" w:uiPriority="37" w:unhideWhenUsed="1"/>
-    <w:lsdException w:name="TOC Heading" w:semiHidden="1" w:uiPriority="39" w:unhideWhenUsed="1" w:qFormat="1"/>
-    <w:lsdException w:name="Plain Table 1" w:uiPriority="41"/>
-    <w:lsdException w:name="Plain Table 2" w:uiPriority="42"/>
-    <w:lsdException w:name="Plain Table 3" w:uiPriority="43"/>
-    <w:lsdException w:name="Plain Table 4" w:uiPriority="44"/>
-    <w:lsdException w:name="Plain Table 5" w:uiPriority="45"/>
-    <w:lsdException w:name="Grid Table Light" w:uiPriority="40"/>
-    <w:lsdException w:name="Grid Table 1 Light" w:uiPriority="46"/>
-    <w:lsdException w:name="Grid Table 2" w:uiPriority="47"/>
-    <w:lsdException w:name="Grid Table 3" w:uiPriority="48"/>
-    <w:lsdException w:name="Grid Table 4" w:uiPriority="49"/>
-    <w:lsdException w:name="Grid Table 5 Dark" w:uiPriority="50"/>
-    <w:lsdException w:name="Grid Table 6 Colorful" w:uiPriority="51"/>
-    <w:lsdException w:name="Grid Table 7 Colorful" w:uiPriority="52"/>
-    <w:lsdException w:name="Grid Table 1 Light Accent 1" w:uiPriority="46"/>
-    <w:lsdException w:name="Grid Table 2 Accent 1" w:uiPriority="47"/>
-    <w:lsdException w:name="Grid Table 3 Accent 1" w:uiPriority="48"/>
-    <w:lsdException w:name="Grid Table 4 Accent 1" w:uiPriority="49"/>
-    <w:lsdException w:name="Grid Table 5 Dark Accent 1" w:uiPriority="50"/>
-    <w:lsdException w:name="Grid Table 6 Colorful Accent 1" w:uiPriority="51"/>
-    <w:lsdException w:name="Grid Table 7 Colorful Accent 1" w:uiPriority="52"/>
-    <w:lsdException w:name="Grid Table 1 Light Accent 2" w:uiPriority="46"/>
-    <w:lsdException w:name="Grid Table 2 Accent 2" w:uiPriority="47"/>
-    <w:lsdException w:name="Grid Table 3 Accent 2" w:uiPriority="48"/>
-    <w:lsdException w:name="Grid Table 4 Accent 2" w:uiPriority="49"/>
-    <w:lsdException w:name="Grid Table 5 Dark Accent 2" w:uiPriority="50"/>
-    <w:lsdException w:name="Grid Table 6 Colorful Accent 2" w:uiPriority="51"/>
-    <w:lsdException w:name="Grid Table 7 Colorful Accent 2" w:uiPriority="52"/>
-    <w:lsdException w:name="Grid Table 1 Light Accent 3" w:uiPriority="46"/>
-    <w:lsdException w:name="Grid Table 2 Accent 3" w:uiPriority="47"/>
-    <w:lsdException w:name="Grid Table 3 Accent 3" w:uiPriority="48"/>
-    <w:lsdException w:name="Grid Table 4 Accent 3" w:uiPriority="49"/>
-    <w:lsdException w:name="Grid Table 5 Dark Accent 3" w:uiPriority="50"/>
-    <w:lsdException w:name="Grid Table 6 Colorful Accent 3" w:uiPriority="51"/>
-    <w:lsdException w:name="Grid Table 7 Colorful Accent 3" w:uiPriority="52"/>
-    <w:lsdException w:name="Grid Table 1 Light Accent 4" w:uiPriority="46"/>
-    <w:lsdException w:name="Grid Table 2 Accent 4" w:uiPriority="47"/>
-    <w:lsdException w:name="Grid Table 3 Accent 4" w:uiPriority="48"/>
-    <w:lsdException w:name="Grid Table 4 Accent 4" w:uiPriority="49"/>
-    <w:lsdException w:name="Grid Table 5 Dark Accent 4" w:uiPriority="50"/>
-    <w:lsdException w:name="Grid Table 6 Colorful Accent 4" w:uiPriority="51"/>
-    <w:lsdException w:name="Grid Table 7 Colorful Accent 4" w:uiPriority="52"/>
-    <w:lsdException w:name="Grid Table 1 Light Accent 5" w:uiPriority="46"/>
-    <w:lsdException w:name="Grid Table 2 Accent 5" w:uiPriority="47"/>
-    <w:lsdException w:name="Grid Table 3 Accent 5" w:uiPriority="48"/>
-    <w:lsdException w:name="Grid Table 4 Accent 5" w:uiPriority="49"/>
-    <w:lsdException w:name="Grid Table 5 Dark Accent 5" w:uiPriority="50"/>
-    <w:lsdException w:name="Grid Table 6 Colorful Accent 5" w:uiPriority="51"/>
-    <w:lsdException w:name="Grid Table 7 Colorful Accent 5" w:uiPriority="52"/>
-    <w:lsdException w:name="Grid Table 1 Light Accent 6" w:uiPriority="46"/>
-    <w:lsdException w:name="Grid Table 2 Accent 6" w:uiPriority="47"/>
-    <w:lsdException w:name="Grid Table 3 Accent 6" w:uiPriority="48"/>
-    <w:lsdException w:name="Grid Table 4 Accent 6" w:uiPriority="49"/>
-    <w:lsdException w:name="Grid Table 5 Dark Accent 6" w:uiPriority="50"/>
-    <w:lsdException w:name="Grid Table 6 Colorful Accent 6" w:uiPriority="51"/>
-    <w:lsdException w:name="Grid Table 7 Colorful Accent 6" w:uiPriority="52"/>
-    <w:lsdException w:name="List Table 1 Light" w:uiPriority="46"/>
-    <w:lsdException w:name="List Table 2" w:uiPriority="47"/>
-    <w:lsdException w:name="List Table 3" w:uiPriority="48"/>
-    <w:lsdException w:name="List Table 4" w:uiPriority="49"/>
-    <w:lsdException w:name="List Table 5 Dark" w:uiPriority="50"/>
-    <w:lsdException w:name="List Table 6 Colorful" w:uiPriority="51"/>
-    <w:lsdException w:name="List Table 7 Colorful" w:uiPriority="52"/>
-    <w:lsdException w:name="List Table 1 Light Accent 1" w:uiPriority="46"/>
-    <w:lsdException w:name="List Table 2 Accent 1" w:uiPriority="47"/>
-    <w:lsdException w:name="List Table 3 Accent 1" w:uiPriority="48"/>
-    <w:lsdException w:name="List Table 4 Accent 1" w:uiPriority="49"/>
-    <w:lsdException w:name="List Table 5 Dark Accent 1" w:uiPriority="50"/>
-    <w:lsdException w:name="List Table 6 Colorful Accent 1" w:uiPriority="51"/>
-    <w:lsdException w:name="List Table 7 Colorful Accent 1" w:uiPriority="52"/>
-    <w:lsdException w:name="List Table 1 Light Accent 2" w:uiPriority="46"/>
-    <w:lsdException w:name="List Table 2 Accent 2" w:uiPriority="47"/>
-    <w:lsdException w:name="List Table 3 Accent 2" w:uiPriority="48"/>
-    <w:lsdException w:name="List Table 4 Accent 2" w:uiPriority="49"/>
-    <w:lsdException w:name="List Table 5 Dark Accent 2" w:uiPriority="50"/>
-    <w:lsdException w:name="List Table 6 Colorful Accent 2" w:uiPriority="51"/>
-    <w:lsdException w:name="List Table 7 Colorful Accent 2" w:uiPriority="52"/>
-    <w:lsdException w:name="List Table 1 Light Accent 3" w:uiPriority="46"/>
-    <w:lsdException w:name="List Table 2 Accent 3" w:uiPriority="47"/>
-    <w:lsdException w:name="List Table 3 Accent 3" w:uiPriority="48"/>
-    <w:lsdException w:name="List Table 4 Accent 3" w:uiPriority="49"/>
-    <w:lsdException w:name="List Table 5 Dark Accent 3" w:uiPriority="50"/>
-    <w:lsdException w:name="List Table 6 Colorful Accent 3" w:uiPriority="51"/>
-    <w:lsdException w:name="List Table 7 Colorful Accent 3" w:uiPriority="52"/>
-    <w:lsdException w:name="List Table 1 Light Accent 4" w:uiPriority="46"/>
-    <w:lsdException w:name="List Table 2 Accent 4" w:uiPriority="47"/>
-    <w:lsdException w:name="List Table 3 Accent 4" w:uiPriority="48"/>
-    <w:lsdException w:name="List Table 4 Accent 4" w:uiPriority="49"/>
-    <w:lsdException w:name="List Table 5 Dark Accent 4" w:uiPriority="50"/>
-    <w:lsdException w:name="List Table 6 Colorful Accent 4" w:uiPriority="51"/>
-    <w:lsdException w:name="List Table 7 Colorful Accent 4" w:uiPriority="52"/>
-    <w:lsdException w:name="List Table 1 Light Accent 5" w:uiPriority="46"/>
-    <w:lsdException w:name="List Table 2 Accent 5" w:uiPriority="47"/>
-    <w:lsdException w:name="List Table 3 Accent 5" w:uiPriority="48"/>
-    <w:lsdException w:name="List Table 4 Accent 5" w:uiPriority="49"/>
-    <w:lsdException w:name="List Table 5 Dark Accent 5" w:uiPriority="50"/>
-    <w:lsdException w:name="List Table 6 Colorful Accent 5" w:uiPriority="51"/>
-    <w:lsdException w:name="List Table 7 Colorful Accent 5" w:uiPriority="52"/>
-    <w:lsdException w:name="List Table 1 Light Accent 6" w:uiPriority="46"/>
-    <w:lsdException w:name="List Table 2 Accent 6" w:uiPriority="47"/>
-    <w:lsdException w:name="List Table 3 Accent 6" w:uiPriority="48"/>
-    <w:lsdException w:name="List Table 4 Accent 6" w:uiPriority="49"/>
-    <w:lsdException w:name="List Table 5 Dark Accent 6" w:uiPriority="50"/>
-    <w:lsdException w:name="List Table 6 Colorful Accent 6" w:uiPriority="51"/>
-    <w:lsdException w:name="List Table 7 Colorful Accent 6" w:uiPriority="52"/>
-    <w:lsdException w:name="Mention" w:semiHidden="1" w:unhideWhenUsed="1"/>
-    <w:lsdException w:name="Smart Hyperlink" w:semiHidden="1" w:unhideWhenUsed="1"/>
-    <w:lsdException w:name="Hashtag" w:semiHidden="1" w:unhideWhenUsed="1"/>
-    <w:lsdException w:name="Unresolved Mention" w:semiHidden="1" w:unhideWhenUsed="1"/>
+  <w:latentStyles w:count="260" w:defQFormat="0" w:defUnhideWhenUsed="1" w:defSemiHidden="1" w:defUIPriority="99" w:defLockedState="0">
+    <w:lsdException w:qFormat="1" w:unhideWhenUsed="0" w:uiPriority="0" w:semiHidden="0" w:name="Normal"/>
+    <w:lsdException w:qFormat="1" w:unhideWhenUsed="0" w:uiPriority="9" w:semiHidden="0" w:name="heading 1"/>
+    <w:lsdException w:qFormat="1" w:uiPriority="9" w:name="heading 2"/>
+    <w:lsdException w:qFormat="1" w:uiPriority="9" w:name="heading 3"/>
+    <w:lsdException w:qFormat="1" w:uiPriority="9" w:name="heading 4"/>
+    <w:lsdException w:qFormat="1" w:uiPriority="9" w:name="heading 5"/>
+    <w:lsdException w:qFormat="1" w:uiPriority="9" w:name="heading 6"/>
+    <w:lsdException w:qFormat="1" w:uiPriority="9" w:name="heading 7"/>
+    <w:lsdException w:qFormat="1" w:uiPriority="9" w:name="heading 8"/>
+    <w:lsdException w:qFormat="1" w:uiPriority="9" w:name="heading 9"/>
+    <w:lsdException w:uiPriority="99" w:name="index 1"/>
+    <w:lsdException w:uiPriority="99" w:name="index 2"/>
+    <w:lsdException w:uiPriority="99" w:name="index 3"/>
+    <w:lsdException w:uiPriority="99" w:name="index 4"/>
+    <w:lsdException w:uiPriority="99" w:name="index 5"/>
+    <w:lsdException w:uiPriority="99" w:name="index 6"/>
+    <w:lsdException w:uiPriority="99" w:name="index 7"/>
+    <w:lsdException w:uiPriority="99" w:name="index 8"/>
+    <w:lsdException w:uiPriority="99" w:name="index 9"/>
+    <w:lsdException w:uiPriority="39" w:name="toc 1"/>
+    <w:lsdException w:uiPriority="39" w:name="toc 2"/>
+    <w:lsdException w:uiPriority="39" w:name="toc 3"/>
+    <w:lsdException w:uiPriority="39" w:name="toc 4"/>
+    <w:lsdException w:uiPriority="39" w:name="toc 5"/>
+    <w:lsdException w:uiPriority="39" w:name="toc 6"/>
+    <w:lsdException w:uiPriority="39" w:name="toc 7"/>
+    <w:lsdException w:uiPriority="39" w:name="toc 8"/>
+    <w:lsdException w:uiPriority="39" w:name="toc 9"/>
+    <w:lsdException w:uiPriority="99" w:name="Normal Indent"/>
+    <w:lsdException w:uiPriority="99" w:name="footnote text"/>
+    <w:lsdException w:uiPriority="99" w:name="annotation text"/>
+    <w:lsdException w:qFormat="1" w:uiPriority="99" w:semiHidden="0" w:name="header"/>
+    <w:lsdException w:qFormat="1" w:uiPriority="99" w:semiHidden="0" w:name="footer"/>
+    <w:lsdException w:uiPriority="99" w:name="index heading"/>
+    <w:lsdException w:qFormat="1" w:uiPriority="35" w:name="caption"/>
+    <w:lsdException w:uiPriority="99" w:name="table of figures"/>
+    <w:lsdException w:uiPriority="99" w:name="envelope address"/>
+    <w:lsdException w:uiPriority="99" w:name="envelope return"/>
+    <w:lsdException w:uiPriority="99" w:name="footnote reference"/>
+    <w:lsdException w:uiPriority="99" w:name="annotation reference"/>
+    <w:lsdException w:uiPriority="99" w:name="line number"/>
+    <w:lsdException w:uiPriority="99" w:name="page number"/>
+    <w:lsdException w:uiPriority="99" w:name="endnote reference"/>
+    <w:lsdException w:uiPriority="99" w:name="endnote text"/>
+    <w:lsdException w:uiPriority="99" w:name="table of authorities"/>
+    <w:lsdException w:uiPriority="99" w:name="macro"/>
+    <w:lsdException w:uiPriority="99" w:name="toa heading"/>
+    <w:lsdException w:uiPriority="99" w:name="List"/>
+    <w:lsdException w:uiPriority="99" w:name="List Bullet"/>
+    <w:lsdException w:uiPriority="99" w:name="List Number"/>
+    <w:lsdException w:uiPriority="99" w:name="List 2"/>
+    <w:lsdException w:uiPriority="99" w:name="List 3"/>
+    <w:lsdException w:uiPriority="99" w:name="List 4"/>
+    <w:lsdException w:uiPriority="99" w:name="List 5"/>
+    <w:lsdException w:uiPriority="99" w:name="List Bullet 2"/>
+    <w:lsdException w:uiPriority="99" w:name="List Bullet 3"/>
+    <w:lsdException w:uiPriority="99" w:name="List Bullet 4"/>
+    <w:lsdException w:uiPriority="99" w:name="List Bullet 5"/>
+    <w:lsdException w:uiPriority="99" w:name="List Number 2"/>
+    <w:lsdException w:uiPriority="99" w:name="List Number 3"/>
+    <w:lsdException w:uiPriority="99" w:name="List Number 4"/>
+    <w:lsdException w:uiPriority="99" w:name="List Number 5"/>
+    <w:lsdException w:qFormat="1" w:unhideWhenUsed="0" w:uiPriority="10" w:semiHidden="0" w:name="Title"/>
+    <w:lsdException w:uiPriority="99" w:name="Closing"/>
+    <w:lsdException w:uiPriority="99" w:name="Signature"/>
+    <w:lsdException w:qFormat="1" w:uiPriority="1" w:semiHidden="0" w:name="Default Paragraph Font"/>
+    <w:lsdException w:uiPriority="99" w:name="Body Text"/>
+    <w:lsdException w:uiPriority="99" w:name="Body Text Indent"/>
+    <w:lsdException w:uiPriority="99" w:name="List Continue"/>
+    <w:lsdException w:uiPriority="99" w:name="List Continue 2"/>
+    <w:lsdException w:uiPriority="99" w:name="List Continue 3"/>
+    <w:lsdException w:uiPriority="99" w:name="List Continue 4"/>
+    <w:lsdException w:uiPriority="99" w:name="List Continue 5"/>
+    <w:lsdException w:uiPriority="99" w:name="Message Header"/>
+    <w:lsdException w:qFormat="1" w:unhideWhenUsed="0" w:uiPriority="11" w:semiHidden="0" w:name="Subtitle"/>
+    <w:lsdException w:uiPriority="99" w:name="Salutation"/>
+    <w:lsdException w:uiPriority="99" w:name="Date"/>
+    <w:lsdException w:uiPriority="99" w:name="Body Text First Indent"/>
+    <w:lsdException w:uiPriority="99" w:name="Body Text First Indent 2"/>
+    <w:lsdException w:uiPriority="99" w:name="Note Heading"/>
+    <w:lsdException w:uiPriority="99" w:name="Body Text 2"/>
+    <w:lsdException w:uiPriority="99" w:name="Body Text 3"/>
+    <w:lsdException w:uiPriority="99" w:name="Body Text Indent 2"/>
+    <w:lsdException w:uiPriority="99" w:name="Body Text Indent 3"/>
+    <w:lsdException w:uiPriority="99" w:name="Block Text"/>
+    <w:lsdException w:qFormat="1" w:uiPriority="99" w:semiHidden="0" w:name="Hyperlink"/>
+    <w:lsdException w:uiPriority="99" w:name="FollowedHyperlink"/>
+    <w:lsdException w:qFormat="1" w:unhideWhenUsed="0" w:uiPriority="22" w:semiHidden="0" w:name="Strong"/>
+    <w:lsdException w:qFormat="1" w:unhideWhenUsed="0" w:uiPriority="20" w:semiHidden="0" w:name="Emphasis"/>
+    <w:lsdException w:uiPriority="99" w:name="Document Map"/>
+    <w:lsdException w:uiPriority="99" w:name="Plain Text"/>
+    <w:lsdException w:uiPriority="99" w:name="E-mail Signature"/>
+    <w:lsdException w:uiPriority="99" w:name="Normal (Web)"/>
+    <w:lsdException w:uiPriority="99" w:name="HTML Acronym"/>
+    <w:lsdException w:uiPriority="99" w:name="HTML Address"/>
+    <w:lsdException w:uiPriority="99" w:name="HTML Cite"/>
+    <w:lsdException w:uiPriority="99" w:name="HTML Code"/>
+    <w:lsdException w:uiPriority="99" w:name="HTML Definition"/>
+    <w:lsdException w:uiPriority="99" w:name="HTML Keyboard"/>
+    <w:lsdException w:uiPriority="99" w:name="HTML Preformatted"/>
+    <w:lsdException w:uiPriority="99" w:name="HTML Sample"/>
+    <w:lsdException w:uiPriority="99" w:name="HTML Typewriter"/>
+    <w:lsdException w:uiPriority="99" w:name="HTML Variable"/>
+    <w:lsdException w:uiPriority="99" w:name="Normal Table"/>
+    <w:lsdException w:uiPriority="99" w:name="annotation subject"/>
+    <w:lsdException w:uiPriority="99" w:name="Table Simple 1"/>
+    <w:lsdException w:uiPriority="99" w:name="Table Simple 2"/>
+    <w:lsdException w:uiPriority="99" w:name="Table Simple 3"/>
+    <w:lsdException w:uiPriority="99" w:name="Table Classic 1"/>
+    <w:lsdException w:uiPriority="99" w:name="Table Classic 2"/>
+    <w:lsdException w:uiPriority="99" w:name="Table Classic 3"/>
+    <w:lsdException w:uiPriority="99" w:name="Table Classic 4"/>
+    <w:lsdException w:uiPriority="99" w:name="Table Colorful 1"/>
+    <w:lsdException w:uiPriority="99" w:name="Table Colorful 2"/>
+    <w:lsdException w:uiPriority="99" w:name="Table Colorful 3"/>
+    <w:lsdException w:uiPriority="99" w:name="Table Columns 1"/>
+    <w:lsdException w:uiPriority="99" w:name="Table Columns 2"/>
+    <w:lsdException w:uiPriority="99" w:name="Table Columns 3"/>
+    <w:lsdException w:uiPriority="99" w:name="Table Columns 4"/>
+    <w:lsdException w:uiPriority="99" w:name="Table Columns 5"/>
+    <w:lsdException w:uiPriority="99" w:name="Table Grid 1"/>
+    <w:lsdException w:uiPriority="99" w:name="Table Grid 2"/>
+    <w:lsdException w:uiPriority="99" w:name="Table Grid 3"/>
+    <w:lsdException w:uiPriority="99" w:name="Table Grid 4"/>
+    <w:lsdException w:uiPriority="99" w:name="Table Grid 5"/>
+    <w:lsdException w:uiPriority="99" w:name="Table Grid 6"/>
+    <w:lsdException w:uiPriority="99" w:name="Table Grid 7"/>
+    <w:lsdException w:uiPriority="99" w:name="Table Grid 8"/>
+    <w:lsdException w:uiPriority="99" w:name="Table List 1"/>
+    <w:lsdException w:uiPriority="99" w:name="Table List 2"/>
+    <w:lsdException w:uiPriority="99" w:name="Table List 3"/>
+    <w:lsdException w:uiPriority="99" w:name="Table List 4"/>
+    <w:lsdException w:uiPriority="99" w:name="Table List 5"/>
+    <w:lsdException w:uiPriority="99" w:name="Table List 6"/>
+    <w:lsdException w:uiPriority="99" w:name="Table List 7"/>
+    <w:lsdException w:uiPriority="99" w:name="Table List 8"/>
+    <w:lsdException w:uiPriority="99" w:name="Table 3D effects 1"/>
+    <w:lsdException w:uiPriority="99" w:name="Table 3D effects 2"/>
+    <w:lsdException w:uiPriority="99" w:name="Table 3D effects 3"/>
+    <w:lsdException w:uiPriority="99" w:name="Table Contemporary"/>
+    <w:lsdException w:uiPriority="99" w:name="Table Elegant"/>
+    <w:lsdException w:uiPriority="99" w:name="Table Professional"/>
+    <w:lsdException w:uiPriority="99" w:name="Table Subtle 1"/>
+    <w:lsdException w:uiPriority="99" w:name="Table Subtle 2"/>
+    <w:lsdException w:uiPriority="99" w:name="Table Web 1"/>
+    <w:lsdException w:uiPriority="99" w:name="Table Web 2"/>
+    <w:lsdException w:uiPriority="99" w:name="Table Web 3"/>
+    <w:lsdException w:uiPriority="99" w:name="Balloon Text"/>
+    <w:lsdException w:qFormat="1" w:unhideWhenUsed="0" w:uiPriority="59" w:semiHidden="0" w:name="Table Grid"/>
+    <w:lsdException w:uiPriority="99" w:name="Table Theme"/>
+    <w:lsdException w:unhideWhenUsed="0" w:uiPriority="60" w:semiHidden="0" w:name="Light Shading"/>
+    <w:lsdException w:unhideWhenUsed="0" w:uiPriority="61" w:semiHidden="0" w:name="Light List"/>
+    <w:lsdException w:unhideWhenUsed="0" w:uiPriority="62" w:semiHidden="0" w:name="Light Grid"/>
+    <w:lsdException w:unhideWhenUsed="0" w:uiPriority="63" w:semiHidden="0" w:name="Medium Shading 1"/>
+    <w:lsdException w:unhideWhenUsed="0" w:uiPriority="64" w:semiHidden="0" w:name="Medium Shading 2"/>
+    <w:lsdException w:unhideWhenUsed="0" w:uiPriority="65" w:semiHidden="0" w:name="Medium List 1"/>
+    <w:lsdException w:unhideWhenUsed="0" w:uiPriority="66" w:semiHidden="0" w:name="Medium List 2"/>
+    <w:lsdException w:unhideWhenUsed="0" w:uiPriority="67" w:semiHidden="0" w:name="Medium Grid 1"/>
+    <w:lsdException w:unhideWhenUsed="0" w:uiPriority="68" w:semiHidden="0" w:name="Medium Grid 2"/>
+    <w:lsdException w:unhideWhenUsed="0" w:uiPriority="69" w:semiHidden="0" w:name="Medium Grid 3"/>
+    <w:lsdException w:unhideWhenUsed="0" w:uiPriority="70" w:semiHidden="0" w:name="Dark List"/>
+    <w:lsdException w:unhideWhenUsed="0" w:uiPriority="71" w:semiHidden="0" w:name="Colorful Shading"/>
+    <w:lsdException w:unhideWhenUsed="0" w:uiPriority="72" w:semiHidden="0" w:name="Colorful List"/>
+    <w:lsdException w:unhideWhenUsed="0" w:uiPriority="73" w:semiHidden="0" w:name="Colorful Grid"/>
+    <w:lsdException w:unhideWhenUsed="0" w:uiPriority="60" w:semiHidden="0" w:name="Light Shading Accent 1"/>
+    <w:lsdException w:unhideWhenUsed="0" w:uiPriority="61" w:semiHidden="0" w:name="Light List Accent 1"/>
+    <w:lsdException w:unhideWhenUsed="0" w:uiPriority="62" w:semiHidden="0" w:name="Light Grid Accent 1"/>
+    <w:lsdException w:unhideWhenUsed="0" w:uiPriority="63" w:semiHidden="0" w:name="Medium Shading 1 Accent 1"/>
+    <w:lsdException w:unhideWhenUsed="0" w:uiPriority="64" w:semiHidden="0" w:name="Medium Shading 2 Accent 1"/>
+    <w:lsdException w:unhideWhenUsed="0" w:uiPriority="65" w:semiHidden="0" w:name="Medium List 1 Accent 1"/>
+    <w:lsdException w:qFormat="1" w:unhideWhenUsed="0" w:uiPriority="34" w:semiHidden="0" w:name="List Paragraph"/>
+    <w:lsdException w:unhideWhenUsed="0" w:uiPriority="66" w:semiHidden="0" w:name="Medium List 2 Accent 1"/>
+    <w:lsdException w:unhideWhenUsed="0" w:uiPriority="67" w:semiHidden="0" w:name="Medium Grid 1 Accent 1"/>
+    <w:lsdException w:unhideWhenUsed="0" w:uiPriority="68" w:semiHidden="0" w:name="Medium Grid 2 Accent 1"/>
+    <w:lsdException w:unhideWhenUsed="0" w:uiPriority="69" w:semiHidden="0" w:name="Medium Grid 3 Accent 1"/>
+    <w:lsdException w:unhideWhenUsed="0" w:uiPriority="70" w:semiHidden="0" w:name="Dark List Accent 1"/>
+    <w:lsdException w:unhideWhenUsed="0" w:uiPriority="71" w:semiHidden="0" w:name="Colorful Shading Accent 1"/>
+    <w:lsdException w:unhideWhenUsed="0" w:uiPriority="72" w:semiHidden="0" w:name="Colorful List Accent 1"/>
+    <w:lsdException w:unhideWhenUsed="0" w:uiPriority="73" w:semiHidden="0" w:name="Colorful Grid Accent 1"/>
+    <w:lsdException w:unhideWhenUsed="0" w:uiPriority="60" w:semiHidden="0" w:name="Light Shading Accent 2"/>
+    <w:lsdException w:unhideWhenUsed="0" w:uiPriority="61" w:semiHidden="0" w:name="Light List Accent 2"/>
+    <w:lsdException w:unhideWhenUsed="0" w:uiPriority="62" w:semiHidden="0" w:name="Light Grid Accent 2"/>
+    <w:lsdException w:unhideWhenUsed="0" w:uiPriority="63" w:semiHidden="0" w:name="Medium Shading 1 Accent 2"/>
+    <w:lsdException w:unhideWhenUsed="0" w:uiPriority="64" w:semiHidden="0" w:name="Medium Shading 2 Accent 2"/>
+    <w:lsdException w:unhideWhenUsed="0" w:uiPriority="65" w:semiHidden="0" w:name="Medium List 1 Accent 2"/>
+    <w:lsdException w:unhideWhenUsed="0" w:uiPriority="66" w:semiHidden="0" w:name="Medium List 2 Accent 2"/>
+    <w:lsdException w:unhideWhenUsed="0" w:uiPriority="67" w:semiHidden="0" w:name="Medium Grid 1 Accent 2"/>
+    <w:lsdException w:unhideWhenUsed="0" w:uiPriority="68" w:semiHidden="0" w:name="Medium Grid 2 Accent 2"/>
+    <w:lsdException w:unhideWhenUsed="0" w:uiPriority="69" w:semiHidden="0" w:name="Medium Grid 3 Accent 2"/>
+    <w:lsdException w:unhideWhenUsed="0" w:uiPriority="70" w:semiHidden="0" w:name="Dark List Accent 2"/>
+    <w:lsdException w:unhideWhenUsed="0" w:uiPriority="71" w:semiHidden="0" w:name="Colorful Shading Accent 2"/>
+    <w:lsdException w:unhideWhenUsed="0" w:uiPriority="72" w:semiHidden="0" w:name="Colorful List Accent 2"/>
+    <w:lsdException w:unhideWhenUsed="0" w:uiPriority="73" w:semiHidden="0" w:name="Colorful Grid Accent 2"/>
+    <w:lsdException w:unhideWhenUsed="0" w:uiPriority="60" w:semiHidden="0" w:name="Light Shading Accent 3"/>
+    <w:lsdException w:unhideWhenUsed="0" w:uiPriority="61" w:semiHidden="0" w:name="Light List Accent 3"/>
+    <w:lsdException w:unhideWhenUsed="0" w:uiPriority="62" w:semiHidden="0" w:name="Light Grid Accent 3"/>
+    <w:lsdException w:unhideWhenUsed="0" w:uiPriority="63" w:semiHidden="0" w:name="Medium Shading 1 Accent 3"/>
+    <w:lsdException w:unhideWhenUsed="0" w:uiPriority="64" w:semiHidden="0" w:name="Medium Shading 2 Accent 3"/>
+    <w:lsdException w:unhideWhenUsed="0" w:uiPriority="65" w:semiHidden="0" w:name="Medium List 1 Accent 3"/>
+    <w:lsdException w:unhideWhenUsed="0" w:uiPriority="66" w:semiHidden="0" w:name="Medium List 2 Accent 3"/>
+    <w:lsdException w:unhideWhenUsed="0" w:uiPriority="67" w:semiHidden="0" w:name="Medium Grid 1 Accent 3"/>
+    <w:lsdException w:unhideWhenUsed="0" w:uiPriority="68" w:semiHidden="0" w:name="Medium Grid 2 Accent 3"/>
+    <w:lsdException w:unhideWhenUsed="0" w:uiPriority="69" w:semiHidden="0" w:name="Medium Grid 3 Accent 3"/>
+    <w:lsdException w:unhideWhenUsed="0" w:uiPriority="70" w:semiHidden="0" w:name="Dark List Accent 3"/>
+    <w:lsdException w:unhideWhenUsed="0" w:uiPriority="71" w:semiHidden="0" w:name="Colorful Shading Accent 3"/>
+    <w:lsdException w:unhideWhenUsed="0" w:uiPriority="72" w:semiHidden="0" w:name="Colorful List Accent 3"/>
+    <w:lsdException w:unhideWhenUsed="0" w:uiPriority="73" w:semiHidden="0" w:name="Colorful Grid Accent 3"/>
+    <w:lsdException w:unhideWhenUsed="0" w:uiPriority="60" w:semiHidden="0" w:name="Light Shading Accent 4"/>
+    <w:lsdException w:unhideWhenUsed="0" w:uiPriority="61" w:semiHidden="0" w:name="Light List Accent 4"/>
+    <w:lsdException w:unhideWhenUsed="0" w:uiPriority="62" w:semiHidden="0" w:name="Light Grid Accent 4"/>
+    <w:lsdException w:unhideWhenUsed="0" w:uiPriority="63" w:semiHidden="0" w:name="Medium Shading 1 Accent 4"/>
+    <w:lsdException w:unhideWhenUsed="0" w:uiPriority="64" w:semiHidden="0" w:name="Medium Shading 2 Accent 4"/>
+    <w:lsdException w:unhideWhenUsed="0" w:uiPriority="65" w:semiHidden="0" w:name="Medium List 1 Accent 4"/>
+    <w:lsdException w:unhideWhenUsed="0" w:uiPriority="66" w:semiHidden="0" w:name="Medium List 2 Accent 4"/>
+    <w:lsdException w:unhideWhenUsed="0" w:uiPriority="67" w:semiHidden="0" w:name="Medium Grid 1 Accent 4"/>
+    <w:lsdException w:unhideWhenUsed="0" w:uiPriority="68" w:semiHidden="0" w:name="Medium Grid 2 Accent 4"/>
+    <w:lsdException w:unhideWhenUsed="0" w:uiPriority="69" w:semiHidden="0" w:name="Medium Grid 3 Accent 4"/>
+    <w:lsdException w:unhideWhenUsed="0" w:uiPriority="70" w:semiHidden="0" w:name="Dark List Accent 4"/>
+    <w:lsdException w:unhideWhenUsed="0" w:uiPriority="71" w:semiHidden="0" w:name="Colorful Shading Accent 4"/>
+    <w:lsdException w:unhideWhenUsed="0" w:uiPriority="72" w:semiHidden="0" w:name="Colorful List Accent 4"/>
+    <w:lsdException w:unhideWhenUsed="0" w:uiPriority="73" w:semiHidden="0" w:name="Colorful Grid Accent 4"/>
+    <w:lsdException w:unhideWhenUsed="0" w:uiPriority="60" w:semiHidden="0" w:name="Light Shading Accent 5"/>
+    <w:lsdException w:unhideWhenUsed="0" w:uiPriority="61" w:semiHidden="0" w:name="Light List Accent 5"/>
+    <w:lsdException w:unhideWhenUsed="0" w:uiPriority="62" w:semiHidden="0" w:name="Light Grid Accent 5"/>
+    <w:lsdException w:unhideWhenUsed="0" w:uiPriority="63" w:semiHidden="0" w:name="Medium Shading 1 Accent 5"/>
+    <w:lsdException w:unhideWhenUsed="0" w:uiPriority="64" w:semiHidden="0" w:name="Medium Shading 2 Accent 5"/>
+    <w:lsdException w:unhideWhenUsed="0" w:uiPriority="65" w:semiHidden="0" w:name="Medium List 1 Accent 5"/>
+    <w:lsdException w:unhideWhenUsed="0" w:uiPriority="66" w:semiHidden="0" w:name="Medium List 2 Accent 5"/>
+    <w:lsdException w:unhideWhenUsed="0" w:uiPriority="67" w:semiHidden="0" w:name="Medium Grid 1 Accent 5"/>
+    <w:lsdException w:unhideWhenUsed="0" w:uiPriority="68" w:semiHidden="0" w:name="Medium Grid 2 Accent 5"/>
+    <w:lsdException w:unhideWhenUsed="0" w:uiPriority="69" w:semiHidden="0" w:name="Medium Grid 3 Accent 5"/>
+    <w:lsdException w:unhideWhenUsed="0" w:uiPriority="70" w:semiHidden="0" w:name="Dark List Accent 5"/>
+    <w:lsdException w:unhideWhenUsed="0" w:uiPriority="71" w:semiHidden="0" w:name="Colorful Shading Accent 5"/>
+    <w:lsdException w:unhideWhenUsed="0" w:uiPriority="72" w:semiHidden="0" w:name="Colorful List Accent 5"/>
+    <w:lsdException w:unhideWhenUsed="0" w:uiPriority="73" w:semiHidden="0" w:name="Colorful Grid Accent 5"/>
+    <w:lsdException w:unhideWhenUsed="0" w:uiPriority="60" w:semiHidden="0" w:name="Light Shading Accent 6"/>
+    <w:lsdException w:unhideWhenUsed="0" w:uiPriority="61" w:semiHidden="0" w:name="Light List Accent 6"/>
+    <w:lsdException w:unhideWhenUsed="0" w:uiPriority="62" w:semiHidden="0" w:name="Light Grid Accent 6"/>
+    <w:lsdException w:unhideWhenUsed="0" w:uiPriority="63" w:semiHidden="0" w:name="Medium Shading 1 Accent 6"/>
+    <w:lsdException w:unhideWhenUsed="0" w:uiPriority="64" w:semiHidden="0" w:name="Medium Shading 2 Accent 6"/>
+    <w:lsdException w:unhideWhenUsed="0" w:uiPriority="65" w:semiHidden="0" w:name="Medium List 1 Accent 6"/>
+    <w:lsdException w:unhideWhenUsed="0" w:uiPriority="66" w:semiHidden="0" w:name="Medium List 2 Accent 6"/>
+    <w:lsdException w:unhideWhenUsed="0" w:uiPriority="67" w:semiHidden="0" w:name="Medium Grid 1 Accent 6"/>
+    <w:lsdException w:unhideWhenUsed="0" w:uiPriority="68" w:semiHidden="0" w:name="Medium Grid 2 Accent 6"/>
+    <w:lsdException w:unhideWhenUsed="0" w:uiPriority="69" w:semiHidden="0" w:name="Medium Grid 3 Accent 6"/>
+    <w:lsdException w:unhideWhenUsed="0" w:uiPriority="70" w:semiHidden="0" w:name="Dark List Accent 6"/>
+    <w:lsdException w:unhideWhenUsed="0" w:uiPriority="71" w:semiHidden="0" w:name="Colorful Shading Accent 6"/>
+    <w:lsdException w:unhideWhenUsed="0" w:uiPriority="72" w:semiHidden="0" w:name="Colorful List Accent 6"/>
+    <w:lsdException w:unhideWhenUsed="0" w:uiPriority="73" w:semiHidden="0" w:name="Colorful Grid Accent 6"/>
   </w:latentStyles>
-  <w:style w:type="paragraph" w:default="1" w:styleId="Normal">
+  <w:style w:type="paragraph" w:default="1" w:styleId="1">
     <w:name w:val="Normal"/>
     <w:qFormat/>
-    <w:rsid w:val="00605B6F"/>
+    <w:uiPriority w:val="0"/>
+    <w:pPr>
+      <w:spacing w:after="200" w:line="276" w:lineRule="auto"/>
+    </w:pPr>
     <w:rPr>
-      <w:lang w:val="en-US"/>
+      <w:rFonts w:asciiTheme="minorHAnsi" w:hAnsiTheme="minorHAnsi" w:eastAsiaTheme="minorEastAsia" w:cstheme="minorBidi"/>
+      <w:sz w:val="22"/>
+      <w:szCs w:val="22"/>
+      <w:lang w:val="en-US" w:eastAsia="zh-CN" w:bidi="ar-SA"/>
     </w:rPr>
   </w:style>
-  <w:style w:type="character" w:default="1" w:styleId="DefaultParagraphFont">
+  <w:style w:type="character" w:default="1" w:styleId="7">
     <w:name w:val="Default Paragraph Font"/>
+    <w:unhideWhenUsed/>
+    <w:qFormat/>
     <w:uiPriority w:val="1"/>
-    <w:unhideWhenUsed/>
   </w:style>
-  <w:style w:type="table" w:default="1" w:styleId="TableNormal">
+  <w:style w:type="table" w:default="1" w:styleId="5">
     <w:name w:val="Normal Table"/>
-    <w:uiPriority w:val="99"/>
     <w:semiHidden/>
     <w:unhideWhenUsed/>
+    <w:uiPriority w:val="99"/>
     <w:tblPr>
-      <w:tblInd w:w="0" w:type="dxa"/>
       <w:tblCellMar>
         <w:top w:w="0" w:type="dxa"/>
         <w:left w:w="108" w:type="dxa"/>
@@ -2794,61 +2229,13 @@
       </w:tblCellMar>
     </w:tblPr>
   </w:style>
-  <w:style w:type="numbering" w:default="1" w:styleId="NoList">
-    <w:name w:val="No List"/>
-    <w:uiPriority w:val="99"/>
+  <w:style w:type="paragraph" w:styleId="2">
+    <w:name w:val="Balloon Text"/>
+    <w:basedOn w:val="1"/>
+    <w:link w:val="10"/>
     <w:semiHidden/>
     <w:unhideWhenUsed/>
-  </w:style>
-  <w:style w:type="character" w:styleId="Hyperlink">
-    <w:name w:val="Hyperlink"/>
-    <w:basedOn w:val="DefaultParagraphFont"/>
     <w:uiPriority w:val="99"/>
-    <w:unhideWhenUsed/>
-    <w:rsid w:val="00605B6F"/>
-    <w:rPr>
-      <w:color w:val="0000FF" w:themeColor="hyperlink"/>
-      <w:u w:val="single"/>
-    </w:rPr>
-  </w:style>
-  <w:style w:type="paragraph" w:styleId="ListParagraph">
-    <w:name w:val="List Paragraph"/>
-    <w:basedOn w:val="Normal"/>
-    <w:uiPriority w:val="34"/>
-    <w:qFormat/>
-    <w:rsid w:val="00605B6F"/>
-    <w:pPr>
-      <w:ind w:left="720"/>
-      <w:contextualSpacing/>
-    </w:pPr>
-  </w:style>
-  <w:style w:type="table" w:styleId="TableGrid">
-    <w:name w:val="Table Grid"/>
-    <w:basedOn w:val="TableNormal"/>
-    <w:uiPriority w:val="59"/>
-    <w:rsid w:val="00605B6F"/>
-    <w:pPr>
-      <w:spacing w:after="0" w:line="240" w:lineRule="auto"/>
-    </w:pPr>
-    <w:tblPr>
-      <w:tblBorders>
-        <w:top w:val="single" w:sz="4" w:space="0" w:color="auto"/>
-        <w:left w:val="single" w:sz="4" w:space="0" w:color="auto"/>
-        <w:bottom w:val="single" w:sz="4" w:space="0" w:color="auto"/>
-        <w:right w:val="single" w:sz="4" w:space="0" w:color="auto"/>
-        <w:insideH w:val="single" w:sz="4" w:space="0" w:color="auto"/>
-        <w:insideV w:val="single" w:sz="4" w:space="0" w:color="auto"/>
-      </w:tblBorders>
-    </w:tblPr>
-  </w:style>
-  <w:style w:type="paragraph" w:styleId="BalloonText">
-    <w:name w:val="Balloon Text"/>
-    <w:basedOn w:val="Normal"/>
-    <w:link w:val="BalloonTextChar"/>
-    <w:uiPriority w:val="99"/>
-    <w:semiHidden/>
-    <w:unhideWhenUsed/>
-    <w:rsid w:val="00605B6F"/>
     <w:pPr>
       <w:spacing w:after="0" w:line="240" w:lineRule="auto"/>
     </w:pPr>
@@ -2858,27 +2245,13 @@
       <w:szCs w:val="16"/>
     </w:rPr>
   </w:style>
-  <w:style w:type="character" w:customStyle="1" w:styleId="BalloonTextChar">
-    <w:name w:val="Balloon Text Char"/>
-    <w:basedOn w:val="DefaultParagraphFont"/>
-    <w:link w:val="BalloonText"/>
+  <w:style w:type="paragraph" w:styleId="3">
+    <w:name w:val="footer"/>
+    <w:basedOn w:val="1"/>
+    <w:link w:val="12"/>
+    <w:unhideWhenUsed/>
+    <w:qFormat/>
     <w:uiPriority w:val="99"/>
-    <w:semiHidden/>
-    <w:rsid w:val="00605B6F"/>
-    <w:rPr>
-      <w:rFonts w:ascii="Tahoma" w:hAnsi="Tahoma" w:cs="Tahoma"/>
-      <w:sz w:val="16"/>
-      <w:szCs w:val="16"/>
-      <w:lang w:val="en-US"/>
-    </w:rPr>
-  </w:style>
-  <w:style w:type="paragraph" w:styleId="Header">
-    <w:name w:val="header"/>
-    <w:basedOn w:val="Normal"/>
-    <w:link w:val="HeaderChar"/>
-    <w:uiPriority w:val="99"/>
-    <w:unhideWhenUsed/>
-    <w:rsid w:val="00976BAE"/>
     <w:pPr>
       <w:tabs>
         <w:tab w:val="center" w:pos="4320"/>
@@ -2887,23 +2260,13 @@
       <w:spacing w:after="0" w:line="240" w:lineRule="auto"/>
     </w:pPr>
   </w:style>
-  <w:style w:type="character" w:customStyle="1" w:styleId="HeaderChar">
-    <w:name w:val="Header Char"/>
-    <w:basedOn w:val="DefaultParagraphFont"/>
-    <w:link w:val="Header"/>
+  <w:style w:type="paragraph" w:styleId="4">
+    <w:name w:val="header"/>
+    <w:basedOn w:val="1"/>
+    <w:link w:val="11"/>
+    <w:unhideWhenUsed/>
+    <w:qFormat/>
     <w:uiPriority w:val="99"/>
-    <w:rsid w:val="00976BAE"/>
-    <w:rPr>
-      <w:lang w:val="en-US"/>
-    </w:rPr>
-  </w:style>
-  <w:style w:type="paragraph" w:styleId="Footer">
-    <w:name w:val="footer"/>
-    <w:basedOn w:val="Normal"/>
-    <w:link w:val="FooterChar"/>
-    <w:uiPriority w:val="99"/>
-    <w:unhideWhenUsed/>
-    <w:rsid w:val="00976BAE"/>
     <w:pPr>
       <w:tabs>
         <w:tab w:val="center" w:pos="4320"/>
@@ -2912,12 +2275,79 @@
       <w:spacing w:after="0" w:line="240" w:lineRule="auto"/>
     </w:pPr>
   </w:style>
-  <w:style w:type="character" w:customStyle="1" w:styleId="FooterChar">
+  <w:style w:type="table" w:styleId="6">
+    <w:name w:val="Table Grid"/>
+    <w:basedOn w:val="5"/>
+    <w:qFormat/>
+    <w:uiPriority w:val="59"/>
+    <w:pPr>
+      <w:spacing w:after="0" w:line="240" w:lineRule="auto"/>
+    </w:pPr>
+    <w:tblPr>
+      <w:tblBorders>
+        <w:top w:val="single" w:color="auto" w:sz="4" w:space="0"/>
+        <w:left w:val="single" w:color="auto" w:sz="4" w:space="0"/>
+        <w:bottom w:val="single" w:color="auto" w:sz="4" w:space="0"/>
+        <w:right w:val="single" w:color="auto" w:sz="4" w:space="0"/>
+        <w:insideH w:val="single" w:color="auto" w:sz="4" w:space="0"/>
+        <w:insideV w:val="single" w:color="auto" w:sz="4" w:space="0"/>
+      </w:tblBorders>
+    </w:tblPr>
+  </w:style>
+  <w:style w:type="character" w:styleId="8">
+    <w:name w:val="Hyperlink"/>
+    <w:basedOn w:val="7"/>
+    <w:unhideWhenUsed/>
+    <w:qFormat/>
+    <w:uiPriority w:val="99"/>
+    <w:rPr>
+      <w:color w:val="0000FF" w:themeColor="hyperlink"/>
+      <w:u w:val="single"/>
+      <w14:textFill>
+        <w14:solidFill>
+          <w14:schemeClr w14:val="hlink"/>
+        </w14:solidFill>
+      </w14:textFill>
+    </w:rPr>
+  </w:style>
+  <w:style w:type="paragraph" w:styleId="9">
+    <w:name w:val="List Paragraph"/>
+    <w:basedOn w:val="1"/>
+    <w:qFormat/>
+    <w:uiPriority w:val="34"/>
+    <w:pPr>
+      <w:ind w:left="720"/>
+      <w:contextualSpacing/>
+    </w:pPr>
+  </w:style>
+  <w:style w:type="character" w:customStyle="1" w:styleId="10">
+    <w:name w:val="Balloon Text Char"/>
+    <w:basedOn w:val="7"/>
+    <w:link w:val="2"/>
+    <w:semiHidden/>
+    <w:uiPriority w:val="99"/>
+    <w:rPr>
+      <w:rFonts w:ascii="Tahoma" w:hAnsi="Tahoma" w:cs="Tahoma"/>
+      <w:sz w:val="16"/>
+      <w:szCs w:val="16"/>
+      <w:lang w:val="en-US"/>
+    </w:rPr>
+  </w:style>
+  <w:style w:type="character" w:customStyle="1" w:styleId="11">
+    <w:name w:val="Header Char"/>
+    <w:basedOn w:val="7"/>
+    <w:link w:val="4"/>
+    <w:uiPriority w:val="99"/>
+    <w:rPr>
+      <w:lang w:val="en-US"/>
+    </w:rPr>
+  </w:style>
+  <w:style w:type="character" w:customStyle="1" w:styleId="12">
     <w:name w:val="Footer Char"/>
-    <w:basedOn w:val="DefaultParagraphFont"/>
-    <w:link w:val="Footer"/>
+    <w:basedOn w:val="7"/>
+    <w:link w:val="3"/>
+    <w:qFormat/>
     <w:uiPriority w:val="99"/>
-    <w:rsid w:val="00976BAE"/>
     <w:rPr>
       <w:lang w:val="en-US"/>
     </w:rPr>
@@ -3206,7 +2636,6 @@
     </a:fmtScheme>
   </a:themeElements>
   <a:objectDefaults/>
-  <a:extraClrSchemeLst/>
 </a:theme>
 </file>
 
@@ -3216,8 +2645,6 @@
 
 <file path=customXml/itemProps1.xml><?xml version="1.0" encoding="utf-8"?>
 <ds:datastoreItem xmlns:ds="http://schemas.openxmlformats.org/officeDocument/2006/customXml" ds:itemID="{38BB029F-A0C4-4FE7-9A23-53F7E0FB609D}">
-  <ds:schemaRefs>
-    <ds:schemaRef ds:uri="http://schemas.openxmlformats.org/officeDocument/2006/bibliography"/>
-  </ds:schemaRefs>
+  <ds:schemaRefs/>
 </ds:datastoreItem>
 </file>
</xml_diff>